<commit_message>
fix: Week 1 complete — CF analytics token, market research updates, pending dashboard changes
</commit_message>
<xml_diff>
--- a/Market Research/3 - Truck Requesters/Truck Requesters - Contact Database.docx
+++ b/Market Research/3 - Truck Requesters/Truck Requesters - Contact Database.docx
@@ -4,7 +4,7 @@
   <w:body>
     <w:p>
       <w:pPr>
-        <w:spacing w:before="0" w:after="120"/>
+        <w:spacing w:after="120" w:before="0"/>
         <w:jc w:val="center"/>
       </w:pPr>
       <w:r>
@@ -21,7 +21,7 @@
     </w:p>
     <w:p>
       <w:pPr>
-        <w:spacing w:before="0" w:after="40"/>
+        <w:spacing w:after="40" w:before="0"/>
         <w:jc w:val="center"/>
       </w:pPr>
       <w:r>
@@ -31,7 +31,7 @@
           <w:sz w:val="18"/>
           <w:szCs w:val="18"/>
         </w:rPr>
-        <w:t xml:space="preserve">ServiceWindow Market Research  |  SWFL  |  Compiled March 31, 2026</w:t>
+        <w:t xml:space="preserve">ServiceWindow Market Research  |  SWFL  |  Compiled April 5, 2026</w:t>
       </w:r>
     </w:p>
     <w:p>
@@ -39,7 +39,7 @@
         <w:pBdr>
           <w:bottom w:val="single" w:color="6E2F1A" w:sz="8"/>
         </w:pBdr>
-        <w:spacing w:before="40" w:after="200"/>
+        <w:spacing w:after="200" w:before="40"/>
       </w:pPr>
       <w:r>
         <w:t xml:space="preserve"/>
@@ -47,7 +47,7 @@
     </w:p>
     <w:p>
       <w:pPr>
-        <w:spacing w:before="0" w:after="200"/>
+        <w:spacing w:after="200" w:before="0"/>
         <w:jc w:val="right"/>
       </w:pPr>
       <w:r>
@@ -59,7 +59,7 @@
           <w:sz w:val="18"/>
           <w:szCs w:val="18"/>
         </w:rPr>
-        <w:t xml:space="preserve">16 entries</w:t>
+        <w:t xml:space="preserve">21 entries</w:t>
       </w:r>
     </w:p>
     <w:p>
@@ -68,7 +68,7 @@
         <w:pBdr>
           <w:bottom w:val="single" w:color="6E2F1A" w:sz="4"/>
         </w:pBdr>
-        <w:spacing w:before="320" w:after="60"/>
+        <w:spacing w:after="60" w:before="320"/>
       </w:pPr>
       <w:r>
         <w:rPr>
@@ -396,19 +396,11 @@
     </w:tbl>
     <w:p>
       <w:pPr>
-        <w:spacing w:before="60" w:after="60"/>
-      </w:pPr>
-      <w:r>
-        <w:t xml:space="preserve"/>
-      </w:r>
-    </w:p>
-    <w:p>
-      <w:pPr>
         <w:pStyle w:val="Heading2"/>
         <w:pBdr>
           <w:bottom w:val="single" w:color="6E2F1A" w:sz="4"/>
         </w:pBdr>
-        <w:spacing w:before="320" w:after="60"/>
+        <w:spacing w:after="60" w:before="320"/>
       </w:pPr>
       <w:r>
         <w:rPr>
@@ -736,19 +728,11 @@
     </w:tbl>
     <w:p>
       <w:pPr>
-        <w:spacing w:before="60" w:after="60"/>
-      </w:pPr>
-      <w:r>
-        <w:t xml:space="preserve"/>
-      </w:r>
-    </w:p>
-    <w:p>
-      <w:pPr>
         <w:pStyle w:val="Heading2"/>
         <w:pBdr>
           <w:bottom w:val="single" w:color="6E2F1A" w:sz="4"/>
         </w:pBdr>
-        <w:spacing w:before="320" w:after="60"/>
+        <w:spacing w:after="60" w:before="320"/>
       </w:pPr>
       <w:r>
         <w:rPr>
@@ -1076,19 +1060,11 @@
     </w:tbl>
     <w:p>
       <w:pPr>
-        <w:spacing w:before="60" w:after="60"/>
-      </w:pPr>
-      <w:r>
-        <w:t xml:space="preserve"/>
-      </w:r>
-    </w:p>
-    <w:p>
-      <w:pPr>
         <w:pStyle w:val="Heading2"/>
         <w:pBdr>
           <w:bottom w:val="single" w:color="6E2F1A" w:sz="4"/>
         </w:pBdr>
-        <w:spacing w:before="320" w:after="60"/>
+        <w:spacing w:after="60" w:before="320"/>
       </w:pPr>
       <w:r>
         <w:rPr>
@@ -1263,6 +1239,65 @@
                 <w:sz w:val="18"/>
                 <w:szCs w:val="18"/>
               </w:rPr>
+              <w:t xml:space="preserve">Phone</w:t>
+            </w:r>
+          </w:p>
+        </w:tc>
+        <w:tc>
+          <w:tcPr>
+            <w:tcW w:type="dxa" w:w="7560"/>
+            <w:tcBorders>
+              <w:top w:val="single" w:color="CCCCCC" w:sz="1"/>
+              <w:left w:val="single" w:color="CCCCCC" w:sz="1"/>
+              <w:bottom w:val="single" w:color="CCCCCC" w:sz="1"/>
+              <w:right w:val="single" w:color="CCCCCC" w:sz="1"/>
+            </w:tcBorders>
+            <w:tcMar>
+              <w:top w:type="dxa" w:w="80"/>
+              <w:left w:type="dxa" w:w="120"/>
+              <w:bottom w:type="dxa" w:w="80"/>
+              <w:right w:type="dxa" w:w="120"/>
+            </w:tcMar>
+          </w:tcPr>
+          <w:p>
+            <w:r>
+              <w:rPr>
+                <w:rFonts w:ascii="Arial" w:cs="Arial" w:eastAsia="Arial" w:hAnsi="Arial"/>
+                <w:sz w:val="18"/>
+                <w:szCs w:val="18"/>
+              </w:rPr>
+              <w:t xml:space="preserve">(239) 689-7067</w:t>
+            </w:r>
+          </w:p>
+        </w:tc>
+      </w:tr>
+      <w:tr>
+        <w:tc>
+          <w:tcPr>
+            <w:tcW w:type="dxa" w:w="1800"/>
+            <w:tcBorders>
+              <w:top w:val="single" w:color="CCCCCC" w:sz="1"/>
+              <w:left w:val="single" w:color="CCCCCC" w:sz="1"/>
+              <w:bottom w:val="single" w:color="CCCCCC" w:sz="1"/>
+              <w:right w:val="single" w:color="CCCCCC" w:sz="1"/>
+            </w:tcBorders>
+            <w:shd w:fill="F2F3F4" w:val="clear"/>
+            <w:tcMar>
+              <w:top w:type="dxa" w:w="80"/>
+              <w:left w:type="dxa" w:w="120"/>
+              <w:bottom w:type="dxa" w:w="80"/>
+              <w:right w:type="dxa" w:w="120"/>
+            </w:tcMar>
+          </w:tcPr>
+          <w:p>
+            <w:r>
+              <w:rPr>
+                <w:rFonts w:ascii="Arial" w:cs="Arial" w:eastAsia="Arial" w:hAnsi="Arial"/>
+                <w:b/>
+                <w:bCs/>
+                <w:sz w:val="18"/>
+                <w:szCs w:val="18"/>
+              </w:rPr>
               <w:t xml:space="preserve">Facebook</w:t>
             </w:r>
           </w:p>
@@ -1408,27 +1443,19 @@
                 <w:sz w:val="18"/>
                 <w:szCs w:val="18"/>
               </w:rPr>
-              <w:t xml:space="preserve">Seeking food trucks for April 9–30, Tuesday–Saturday, dinner and weekend shifts. Residential community. 21 comments. Potential for recurring relationship.</w:t>
+              <w:t xml:space="preserve">Seeking food trucks for April 9–30, Tuesday–Saturday, dinner and weekend shifts. Residential community. 21 comments. Potential for recurring relationship. [2026-04-02 web-enriched] Leasing office phone found: (239) 689-7067.</w:t>
             </w:r>
           </w:p>
         </w:tc>
       </w:tr>
     </w:tbl>
-    <w:p>
-      <w:pPr>
-        <w:spacing w:before="60" w:after="60"/>
-      </w:pPr>
-      <w:r>
-        <w:t xml:space="preserve"/>
-      </w:r>
-    </w:p>
     <w:p>
       <w:pPr>
         <w:pStyle w:val="Heading2"/>
         <w:pBdr>
           <w:bottom w:val="single" w:color="6E2F1A" w:sz="4"/>
         </w:pBdr>
-        <w:spacing w:before="320" w:after="60"/>
+        <w:spacing w:after="60" w:before="320"/>
       </w:pPr>
       <w:r>
         <w:rPr>
@@ -1756,19 +1783,11 @@
     </w:tbl>
     <w:p>
       <w:pPr>
-        <w:spacing w:before="60" w:after="60"/>
-      </w:pPr>
-      <w:r>
-        <w:t xml:space="preserve"/>
-      </w:r>
-    </w:p>
-    <w:p>
-      <w:pPr>
         <w:pStyle w:val="Heading2"/>
         <w:pBdr>
           <w:bottom w:val="single" w:color="6E2F1A" w:sz="4"/>
         </w:pBdr>
-        <w:spacing w:before="320" w:after="60"/>
+        <w:spacing w:after="60" w:before="320"/>
       </w:pPr>
       <w:r>
         <w:rPr>
@@ -2096,19 +2115,11 @@
     </w:tbl>
     <w:p>
       <w:pPr>
-        <w:spacing w:before="60" w:after="60"/>
-      </w:pPr>
-      <w:r>
-        <w:t xml:space="preserve"/>
-      </w:r>
-    </w:p>
-    <w:p>
-      <w:pPr>
         <w:pStyle w:val="Heading2"/>
         <w:pBdr>
           <w:bottom w:val="single" w:color="6E2F1A" w:sz="4"/>
         </w:pBdr>
-        <w:spacing w:before="320" w:after="60"/>
+        <w:spacing w:after="60" w:before="320"/>
       </w:pPr>
       <w:r>
         <w:rPr>
@@ -2436,19 +2447,11 @@
     </w:tbl>
     <w:p>
       <w:pPr>
-        <w:spacing w:before="60" w:after="60"/>
-      </w:pPr>
-      <w:r>
-        <w:t xml:space="preserve"/>
-      </w:r>
-    </w:p>
-    <w:p>
-      <w:pPr>
         <w:pStyle w:val="Heading2"/>
         <w:pBdr>
           <w:bottom w:val="single" w:color="6E2F1A" w:sz="4"/>
         </w:pBdr>
-        <w:spacing w:before="320" w:after="60"/>
+        <w:spacing w:after="60" w:before="320"/>
       </w:pPr>
       <w:r>
         <w:rPr>
@@ -2776,19 +2779,11 @@
     </w:tbl>
     <w:p>
       <w:pPr>
-        <w:spacing w:before="60" w:after="60"/>
-      </w:pPr>
-      <w:r>
-        <w:t xml:space="preserve"/>
-      </w:r>
-    </w:p>
-    <w:p>
-      <w:pPr>
         <w:pStyle w:val="Heading2"/>
         <w:pBdr>
           <w:bottom w:val="single" w:color="6E2F1A" w:sz="4"/>
         </w:pBdr>
-        <w:spacing w:before="320" w:after="60"/>
+        <w:spacing w:after="60" w:before="320"/>
       </w:pPr>
       <w:r>
         <w:rPr>
@@ -3116,19 +3111,11 @@
     </w:tbl>
     <w:p>
       <w:pPr>
-        <w:spacing w:before="60" w:after="60"/>
-      </w:pPr>
-      <w:r>
-        <w:t xml:space="preserve"/>
-      </w:r>
-    </w:p>
-    <w:p>
-      <w:pPr>
         <w:pStyle w:val="Heading2"/>
         <w:pBdr>
           <w:bottom w:val="single" w:color="6E2F1A" w:sz="4"/>
         </w:pBdr>
-        <w:spacing w:before="320" w:after="60"/>
+        <w:spacing w:after="60" w:before="320"/>
       </w:pPr>
       <w:r>
         <w:rPr>
@@ -3456,19 +3443,11 @@
     </w:tbl>
     <w:p>
       <w:pPr>
-        <w:spacing w:before="60" w:after="60"/>
-      </w:pPr>
-      <w:r>
-        <w:t xml:space="preserve"/>
-      </w:r>
-    </w:p>
-    <w:p>
-      <w:pPr>
         <w:pStyle w:val="Heading2"/>
         <w:pBdr>
           <w:bottom w:val="single" w:color="6E2F1A" w:sz="4"/>
         </w:pBdr>
-        <w:spacing w:before="320" w:after="60"/>
+        <w:spacing w:after="60" w:before="320"/>
       </w:pPr>
       <w:r>
         <w:rPr>
@@ -3796,19 +3775,11 @@
     </w:tbl>
     <w:p>
       <w:pPr>
-        <w:spacing w:before="60" w:after="60"/>
-      </w:pPr>
-      <w:r>
-        <w:t xml:space="preserve"/>
-      </w:r>
-    </w:p>
-    <w:p>
-      <w:pPr>
         <w:pStyle w:val="Heading2"/>
         <w:pBdr>
           <w:bottom w:val="single" w:color="6E2F1A" w:sz="4"/>
         </w:pBdr>
-        <w:spacing w:before="320" w:after="60"/>
+        <w:spacing w:after="60" w:before="320"/>
       </w:pPr>
       <w:r>
         <w:rPr>
@@ -4136,19 +4107,11 @@
     </w:tbl>
     <w:p>
       <w:pPr>
-        <w:spacing w:before="60" w:after="60"/>
-      </w:pPr>
-      <w:r>
-        <w:t xml:space="preserve"/>
-      </w:r>
-    </w:p>
-    <w:p>
-      <w:pPr>
         <w:pStyle w:val="Heading2"/>
         <w:pBdr>
           <w:bottom w:val="single" w:color="6E2F1A" w:sz="4"/>
         </w:pBdr>
-        <w:spacing w:before="320" w:after="60"/>
+        <w:spacing w:after="60" w:before="320"/>
       </w:pPr>
       <w:r>
         <w:rPr>
@@ -4468,27 +4431,19 @@
                 <w:sz w:val="18"/>
                 <w:szCs w:val="18"/>
               </w:rPr>
-              <w:t xml:space="preserve">Seeking truck for a farmers market. Location near I-75/Hwy 80, Fort Myers.</w:t>
+              <w:t xml:space="preserve">Seeking truck for a farmers market. Location near I-75/Hwy 80, Fort Myers. [2026-04-02] April 3 event details: 11AM–1:30PM, farmers market, Fort Myers near I-75/Hwy 80, ~50 orders, sandwiches preferred. Private community. DaChef's Pancakes &amp; Grill already replied (239-758-2143) and asked for more dates.</w:t>
             </w:r>
           </w:p>
         </w:tc>
       </w:tr>
     </w:tbl>
-    <w:p>
-      <w:pPr>
-        <w:spacing w:before="60" w:after="60"/>
-      </w:pPr>
-      <w:r>
-        <w:t xml:space="preserve"/>
-      </w:r>
-    </w:p>
     <w:p>
       <w:pPr>
         <w:pStyle w:val="Heading2"/>
         <w:pBdr>
           <w:bottom w:val="single" w:color="6E2F1A" w:sz="4"/>
         </w:pBdr>
-        <w:spacing w:before="320" w:after="60"/>
+        <w:spacing w:after="60" w:before="320"/>
       </w:pPr>
       <w:r>
         <w:rPr>
@@ -4816,19 +4771,11 @@
     </w:tbl>
     <w:p>
       <w:pPr>
-        <w:spacing w:before="60" w:after="60"/>
-      </w:pPr>
-      <w:r>
-        <w:t xml:space="preserve"/>
-      </w:r>
-    </w:p>
-    <w:p>
-      <w:pPr>
         <w:pStyle w:val="Heading2"/>
         <w:pBdr>
           <w:bottom w:val="single" w:color="6E2F1A" w:sz="4"/>
         </w:pBdr>
-        <w:spacing w:before="320" w:after="60"/>
+        <w:spacing w:after="60" w:before="320"/>
       </w:pPr>
       <w:r>
         <w:rPr>
@@ -5097,19 +5044,11 @@
     </w:tbl>
     <w:p>
       <w:pPr>
-        <w:spacing w:before="60" w:after="60"/>
-      </w:pPr>
-      <w:r>
-        <w:t xml:space="preserve"/>
-      </w:r>
-    </w:p>
-    <w:p>
-      <w:pPr>
         <w:pStyle w:val="Heading2"/>
         <w:pBdr>
           <w:bottom w:val="single" w:color="6E2F1A" w:sz="4"/>
         </w:pBdr>
-        <w:spacing w:before="320" w:after="60"/>
+        <w:spacing w:after="60" w:before="320"/>
       </w:pPr>
       <w:r>
         <w:rPr>
@@ -5437,16 +5376,1667 @@
     </w:tbl>
     <w:p>
       <w:pPr>
-        <w:spacing w:before="60" w:after="60"/>
+        <w:pStyle w:val="Heading2"/>
+        <w:pBdr>
+          <w:bottom w:val="single" w:color="6E2F1A" w:sz="4"/>
+        </w:pBdr>
+        <w:spacing w:after="60" w:before="320"/>
       </w:pPr>
       <w:r>
-        <w:t xml:space="preserve"/>
+        <w:rPr>
+          <w:rFonts w:ascii="Arial" w:cs="Arial" w:eastAsia="Arial" w:hAnsi="Arial"/>
+          <w:b/>
+          <w:bCs/>
+          <w:color w:val="6E2F1A"/>
+          <w:sz w:val="26"/>
+          <w:szCs w:val="26"/>
+        </w:rPr>
+        <w:t xml:space="preserve">Tiffany Allard — NE Cape Easter Egg Hunt</w:t>
       </w:r>
     </w:p>
+    <w:tbl>
+      <w:tblPr>
+        <w:tblW w:type="dxa" w:w="9360"/>
+        <w:tblBorders>
+          <w:top w:val="single" w:color="auto" w:sz="4"/>
+          <w:left w:val="single" w:color="auto" w:sz="4"/>
+          <w:bottom w:val="single" w:color="auto" w:sz="4"/>
+          <w:right w:val="single" w:color="auto" w:sz="4"/>
+          <w:insideH w:val="single" w:color="auto" w:sz="4"/>
+          <w:insideV w:val="single" w:color="auto" w:sz="4"/>
+        </w:tblBorders>
+      </w:tblPr>
+      <w:tblGrid>
+        <w:gridCol w:w="1800"/>
+        <w:gridCol w:w="7560"/>
+      </w:tblGrid>
+      <w:tr>
+        <w:tc>
+          <w:tcPr>
+            <w:tcW w:type="dxa" w:w="1800"/>
+            <w:tcBorders>
+              <w:top w:val="single" w:color="CCCCCC" w:sz="1"/>
+              <w:left w:val="single" w:color="CCCCCC" w:sz="1"/>
+              <w:bottom w:val="single" w:color="CCCCCC" w:sz="1"/>
+              <w:right w:val="single" w:color="CCCCCC" w:sz="1"/>
+            </w:tcBorders>
+            <w:shd w:fill="F2F3F4" w:val="clear"/>
+            <w:tcMar>
+              <w:top w:type="dxa" w:w="80"/>
+              <w:left w:type="dxa" w:w="120"/>
+              <w:bottom w:type="dxa" w:w="80"/>
+              <w:right w:type="dxa" w:w="120"/>
+            </w:tcMar>
+          </w:tcPr>
+          <w:p>
+            <w:r>
+              <w:rPr>
+                <w:rFonts w:ascii="Arial" w:cs="Arial" w:eastAsia="Arial" w:hAnsi="Arial"/>
+                <w:b/>
+                <w:bCs/>
+                <w:sz w:val="18"/>
+                <w:szCs w:val="18"/>
+              </w:rPr>
+              <w:t xml:space="preserve">Primary Contact</w:t>
+            </w:r>
+          </w:p>
+        </w:tc>
+        <w:tc>
+          <w:tcPr>
+            <w:tcW w:type="dxa" w:w="7560"/>
+            <w:tcBorders>
+              <w:top w:val="single" w:color="CCCCCC" w:sz="1"/>
+              <w:left w:val="single" w:color="CCCCCC" w:sz="1"/>
+              <w:bottom w:val="single" w:color="CCCCCC" w:sz="1"/>
+              <w:right w:val="single" w:color="CCCCCC" w:sz="1"/>
+            </w:tcBorders>
+            <w:tcMar>
+              <w:top w:type="dxa" w:w="80"/>
+              <w:left w:type="dxa" w:w="120"/>
+              <w:bottom w:type="dxa" w:w="80"/>
+              <w:right w:type="dxa" w:w="120"/>
+            </w:tcMar>
+          </w:tcPr>
+          <w:p>
+            <w:r>
+              <w:rPr>
+                <w:rFonts w:ascii="Arial" w:cs="Arial" w:eastAsia="Arial" w:hAnsi="Arial"/>
+                <w:sz w:val="18"/>
+                <w:szCs w:val="18"/>
+              </w:rPr>
+              <w:t xml:space="preserve">Tiffany Allard</w:t>
+            </w:r>
+          </w:p>
+        </w:tc>
+      </w:tr>
+      <w:tr>
+        <w:tc>
+          <w:tcPr>
+            <w:tcW w:type="dxa" w:w="1800"/>
+            <w:tcBorders>
+              <w:top w:val="single" w:color="CCCCCC" w:sz="1"/>
+              <w:left w:val="single" w:color="CCCCCC" w:sz="1"/>
+              <w:bottom w:val="single" w:color="CCCCCC" w:sz="1"/>
+              <w:right w:val="single" w:color="CCCCCC" w:sz="1"/>
+            </w:tcBorders>
+            <w:shd w:fill="F2F3F4" w:val="clear"/>
+            <w:tcMar>
+              <w:top w:type="dxa" w:w="80"/>
+              <w:left w:type="dxa" w:w="120"/>
+              <w:bottom w:type="dxa" w:w="80"/>
+              <w:right w:type="dxa" w:w="120"/>
+            </w:tcMar>
+          </w:tcPr>
+          <w:p>
+            <w:r>
+              <w:rPr>
+                <w:rFonts w:ascii="Arial" w:cs="Arial" w:eastAsia="Arial" w:hAnsi="Arial"/>
+                <w:b/>
+                <w:bCs/>
+                <w:sz w:val="18"/>
+                <w:szCs w:val="18"/>
+              </w:rPr>
+              <w:t xml:space="preserve">Source</w:t>
+            </w:r>
+          </w:p>
+        </w:tc>
+        <w:tc>
+          <w:tcPr>
+            <w:tcW w:type="dxa" w:w="7560"/>
+            <w:tcBorders>
+              <w:top w:val="single" w:color="CCCCCC" w:sz="1"/>
+              <w:left w:val="single" w:color="CCCCCC" w:sz="1"/>
+              <w:bottom w:val="single" w:color="CCCCCC" w:sz="1"/>
+              <w:right w:val="single" w:color="CCCCCC" w:sz="1"/>
+            </w:tcBorders>
+            <w:tcMar>
+              <w:top w:type="dxa" w:w="80"/>
+              <w:left w:type="dxa" w:w="120"/>
+              <w:bottom w:type="dxa" w:w="80"/>
+              <w:right w:type="dxa" w:w="120"/>
+            </w:tcMar>
+          </w:tcPr>
+          <w:p>
+            <w:r>
+              <w:rPr>
+                <w:rFonts w:ascii="Arial" w:cs="Arial" w:eastAsia="Arial" w:hAnsi="Arial"/>
+                <w:sz w:val="18"/>
+                <w:szCs w:val="18"/>
+              </w:rPr>
+              <w:t xml:space="preserve">Food Truck Connection of SWFL</w:t>
+            </w:r>
+          </w:p>
+        </w:tc>
+      </w:tr>
+      <w:tr>
+        <w:tc>
+          <w:tcPr>
+            <w:tcW w:type="dxa" w:w="1800"/>
+            <w:tcBorders>
+              <w:top w:val="single" w:color="CCCCCC" w:sz="1"/>
+              <w:left w:val="single" w:color="CCCCCC" w:sz="1"/>
+              <w:bottom w:val="single" w:color="CCCCCC" w:sz="1"/>
+              <w:right w:val="single" w:color="CCCCCC" w:sz="1"/>
+            </w:tcBorders>
+            <w:shd w:fill="F2F3F4" w:val="clear"/>
+            <w:tcMar>
+              <w:top w:type="dxa" w:w="80"/>
+              <w:left w:type="dxa" w:w="120"/>
+              <w:bottom w:type="dxa" w:w="80"/>
+              <w:right w:type="dxa" w:w="120"/>
+            </w:tcMar>
+          </w:tcPr>
+          <w:p>
+            <w:r>
+              <w:rPr>
+                <w:rFonts w:ascii="Arial" w:cs="Arial" w:eastAsia="Arial" w:hAnsi="Arial"/>
+                <w:b/>
+                <w:bCs/>
+                <w:sz w:val="18"/>
+                <w:szCs w:val="18"/>
+              </w:rPr>
+              <w:t xml:space="preserve">Facebook</w:t>
+            </w:r>
+          </w:p>
+        </w:tc>
+        <w:tc>
+          <w:tcPr>
+            <w:tcW w:type="dxa" w:w="7560"/>
+            <w:tcBorders>
+              <w:top w:val="single" w:color="CCCCCC" w:sz="1"/>
+              <w:left w:val="single" w:color="CCCCCC" w:sz="1"/>
+              <w:bottom w:val="single" w:color="CCCCCC" w:sz="1"/>
+              <w:right w:val="single" w:color="CCCCCC" w:sz="1"/>
+            </w:tcBorders>
+            <w:tcMar>
+              <w:top w:type="dxa" w:w="80"/>
+              <w:left w:type="dxa" w:w="120"/>
+              <w:bottom w:type="dxa" w:w="80"/>
+              <w:right w:type="dxa" w:w="120"/>
+            </w:tcMar>
+          </w:tcPr>
+          <w:p>
+            <w:r>
+              <w:rPr>
+                <w:rFonts w:ascii="Arial" w:cs="Arial" w:eastAsia="Arial" w:hAnsi="Arial"/>
+                <w:sz w:val="18"/>
+                <w:szCs w:val="18"/>
+              </w:rPr>
+              <w:t xml:space="preserve">Reply to Tiffany Allard post in Food Truck Connection of SWFL</w:t>
+            </w:r>
+          </w:p>
+        </w:tc>
+      </w:tr>
+      <w:tr>
+        <w:tc>
+          <w:tcPr>
+            <w:tcW w:type="dxa" w:w="1800"/>
+            <w:tcBorders>
+              <w:top w:val="single" w:color="CCCCCC" w:sz="1"/>
+              <w:left w:val="single" w:color="CCCCCC" w:sz="1"/>
+              <w:bottom w:val="single" w:color="CCCCCC" w:sz="1"/>
+              <w:right w:val="single" w:color="CCCCCC" w:sz="1"/>
+            </w:tcBorders>
+            <w:shd w:fill="F2F3F4" w:val="clear"/>
+            <w:tcMar>
+              <w:top w:type="dxa" w:w="80"/>
+              <w:left w:type="dxa" w:w="120"/>
+              <w:bottom w:type="dxa" w:w="80"/>
+              <w:right w:type="dxa" w:w="120"/>
+            </w:tcMar>
+          </w:tcPr>
+          <w:p>
+            <w:r>
+              <w:rPr>
+                <w:rFonts w:ascii="Arial" w:cs="Arial" w:eastAsia="Arial" w:hAnsi="Arial"/>
+                <w:b/>
+                <w:bCs/>
+                <w:sz w:val="18"/>
+                <w:szCs w:val="18"/>
+              </w:rPr>
+              <w:t xml:space="preserve">Location</w:t>
+            </w:r>
+          </w:p>
+        </w:tc>
+        <w:tc>
+          <w:tcPr>
+            <w:tcW w:type="dxa" w:w="7560"/>
+            <w:tcBorders>
+              <w:top w:val="single" w:color="CCCCCC" w:sz="1"/>
+              <w:left w:val="single" w:color="CCCCCC" w:sz="1"/>
+              <w:bottom w:val="single" w:color="CCCCCC" w:sz="1"/>
+              <w:right w:val="single" w:color="CCCCCC" w:sz="1"/>
+            </w:tcBorders>
+            <w:tcMar>
+              <w:top w:type="dxa" w:w="80"/>
+              <w:left w:type="dxa" w:w="120"/>
+              <w:bottom w:type="dxa" w:w="80"/>
+              <w:right w:type="dxa" w:w="120"/>
+            </w:tcMar>
+          </w:tcPr>
+          <w:p>
+            <w:r>
+              <w:rPr>
+                <w:rFonts w:ascii="Arial" w:cs="Arial" w:eastAsia="Arial" w:hAnsi="Arial"/>
+                <w:sz w:val="18"/>
+                <w:szCs w:val="18"/>
+              </w:rPr>
+              <w:t xml:space="preserve">NE Cape Coral, FL</w:t>
+            </w:r>
+          </w:p>
+        </w:tc>
+      </w:tr>
+      <w:tr>
+        <w:tc>
+          <w:tcPr>
+            <w:tcW w:type="dxa" w:w="1800"/>
+            <w:tcBorders>
+              <w:top w:val="single" w:color="CCCCCC" w:sz="1"/>
+              <w:left w:val="single" w:color="CCCCCC" w:sz="1"/>
+              <w:bottom w:val="single" w:color="CCCCCC" w:sz="1"/>
+              <w:right w:val="single" w:color="CCCCCC" w:sz="1"/>
+            </w:tcBorders>
+            <w:shd w:fill="F2F3F4" w:val="clear"/>
+            <w:tcMar>
+              <w:top w:type="dxa" w:w="80"/>
+              <w:left w:type="dxa" w:w="120"/>
+              <w:bottom w:type="dxa" w:w="80"/>
+              <w:right w:type="dxa" w:w="120"/>
+            </w:tcMar>
+          </w:tcPr>
+          <w:p>
+            <w:r>
+              <w:rPr>
+                <w:rFonts w:ascii="Arial" w:cs="Arial" w:eastAsia="Arial" w:hAnsi="Arial"/>
+                <w:b/>
+                <w:bCs/>
+                <w:sz w:val="18"/>
+                <w:szCs w:val="18"/>
+              </w:rPr>
+              <w:t xml:space="preserve">Notes</w:t>
+            </w:r>
+          </w:p>
+        </w:tc>
+        <w:tc>
+          <w:tcPr>
+            <w:tcW w:type="dxa" w:w="7560"/>
+            <w:tcBorders>
+              <w:top w:val="single" w:color="CCCCCC" w:sz="1"/>
+              <w:left w:val="single" w:color="CCCCCC" w:sz="1"/>
+              <w:bottom w:val="single" w:color="CCCCCC" w:sz="1"/>
+              <w:right w:val="single" w:color="CCCCCC" w:sz="1"/>
+            </w:tcBorders>
+            <w:tcMar>
+              <w:top w:type="dxa" w:w="80"/>
+              <w:left w:type="dxa" w:w="120"/>
+              <w:bottom w:type="dxa" w:w="80"/>
+              <w:right w:type="dxa" w:w="120"/>
+            </w:tcMar>
+          </w:tcPr>
+          <w:p>
+            <w:r>
+              <w:rPr>
+                <w:rFonts w:ascii="Arial" w:cs="Arial" w:eastAsia="Arial" w:hAnsi="Arial"/>
+                <w:sz w:val="18"/>
+                <w:szCs w:val="18"/>
+              </w:rPr>
+              <w:t xml:space="preserve">URGENT. Easter Egg Hunt April 4, ~700 homes. Needs breakfast/brunch truck 10am-12pm or 1pm slot. Original truck canceled — replacement needed 3 days out. Lupita's Mini Pancakes responded in comments but not confirmed booked.</w:t>
+            </w:r>
+          </w:p>
+        </w:tc>
+      </w:tr>
+    </w:tbl>
+    <w:p>
+      <w:pPr>
+        <w:pStyle w:val="Heading2"/>
+        <w:pBdr>
+          <w:bottom w:val="single" w:color="6E2F1A" w:sz="4"/>
+        </w:pBdr>
+        <w:spacing w:after="60" w:before="320"/>
+      </w:pPr>
+      <w:r>
+        <w:rPr>
+          <w:rFonts w:ascii="Arial" w:cs="Arial" w:eastAsia="Arial" w:hAnsi="Arial"/>
+          <w:b/>
+          <w:bCs/>
+          <w:color w:val="6E2F1A"/>
+          <w:sz w:val="26"/>
+          <w:szCs w:val="26"/>
+        </w:rPr>
+        <w:t xml:space="preserve">Henry F. Amen — Lago Apartments</w:t>
+      </w:r>
+    </w:p>
+    <w:tbl>
+      <w:tblPr>
+        <w:tblW w:type="dxa" w:w="9360"/>
+        <w:tblBorders>
+          <w:top w:val="single" w:color="auto" w:sz="4"/>
+          <w:left w:val="single" w:color="auto" w:sz="4"/>
+          <w:bottom w:val="single" w:color="auto" w:sz="4"/>
+          <w:right w:val="single" w:color="auto" w:sz="4"/>
+          <w:insideH w:val="single" w:color="auto" w:sz="4"/>
+          <w:insideV w:val="single" w:color="auto" w:sz="4"/>
+        </w:tblBorders>
+      </w:tblPr>
+      <w:tblGrid>
+        <w:gridCol w:w="1800"/>
+        <w:gridCol w:w="7560"/>
+      </w:tblGrid>
+      <w:tr>
+        <w:tc>
+          <w:tcPr>
+            <w:tcW w:type="dxa" w:w="1800"/>
+            <w:tcBorders>
+              <w:top w:val="single" w:color="CCCCCC" w:sz="1"/>
+              <w:left w:val="single" w:color="CCCCCC" w:sz="1"/>
+              <w:bottom w:val="single" w:color="CCCCCC" w:sz="1"/>
+              <w:right w:val="single" w:color="CCCCCC" w:sz="1"/>
+            </w:tcBorders>
+            <w:shd w:fill="F2F3F4" w:val="clear"/>
+            <w:tcMar>
+              <w:top w:type="dxa" w:w="80"/>
+              <w:left w:type="dxa" w:w="120"/>
+              <w:bottom w:type="dxa" w:w="80"/>
+              <w:right w:type="dxa" w:w="120"/>
+            </w:tcMar>
+          </w:tcPr>
+          <w:p>
+            <w:r>
+              <w:rPr>
+                <w:rFonts w:ascii="Arial" w:cs="Arial" w:eastAsia="Arial" w:hAnsi="Arial"/>
+                <w:b/>
+                <w:bCs/>
+                <w:sz w:val="18"/>
+                <w:szCs w:val="18"/>
+              </w:rPr>
+              <w:t xml:space="preserve">Primary Contact</w:t>
+            </w:r>
+          </w:p>
+        </w:tc>
+        <w:tc>
+          <w:tcPr>
+            <w:tcW w:type="dxa" w:w="7560"/>
+            <w:tcBorders>
+              <w:top w:val="single" w:color="CCCCCC" w:sz="1"/>
+              <w:left w:val="single" w:color="CCCCCC" w:sz="1"/>
+              <w:bottom w:val="single" w:color="CCCCCC" w:sz="1"/>
+              <w:right w:val="single" w:color="CCCCCC" w:sz="1"/>
+            </w:tcBorders>
+            <w:tcMar>
+              <w:top w:type="dxa" w:w="80"/>
+              <w:left w:type="dxa" w:w="120"/>
+              <w:bottom w:type="dxa" w:w="80"/>
+              <w:right w:type="dxa" w:w="120"/>
+            </w:tcMar>
+          </w:tcPr>
+          <w:p>
+            <w:r>
+              <w:rPr>
+                <w:rFonts w:ascii="Arial" w:cs="Arial" w:eastAsia="Arial" w:hAnsi="Arial"/>
+                <w:sz w:val="18"/>
+                <w:szCs w:val="18"/>
+              </w:rPr>
+              <w:t xml:space="preserve">Henry F. Amen</w:t>
+            </w:r>
+          </w:p>
+        </w:tc>
+      </w:tr>
+      <w:tr>
+        <w:tc>
+          <w:tcPr>
+            <w:tcW w:type="dxa" w:w="1800"/>
+            <w:tcBorders>
+              <w:top w:val="single" w:color="CCCCCC" w:sz="1"/>
+              <w:left w:val="single" w:color="CCCCCC" w:sz="1"/>
+              <w:bottom w:val="single" w:color="CCCCCC" w:sz="1"/>
+              <w:right w:val="single" w:color="CCCCCC" w:sz="1"/>
+            </w:tcBorders>
+            <w:shd w:fill="F2F3F4" w:val="clear"/>
+            <w:tcMar>
+              <w:top w:type="dxa" w:w="80"/>
+              <w:left w:type="dxa" w:w="120"/>
+              <w:bottom w:type="dxa" w:w="80"/>
+              <w:right w:type="dxa" w:w="120"/>
+            </w:tcMar>
+          </w:tcPr>
+          <w:p>
+            <w:r>
+              <w:rPr>
+                <w:rFonts w:ascii="Arial" w:cs="Arial" w:eastAsia="Arial" w:hAnsi="Arial"/>
+                <w:b/>
+                <w:bCs/>
+                <w:sz w:val="18"/>
+                <w:szCs w:val="18"/>
+              </w:rPr>
+              <w:t xml:space="preserve">Source</w:t>
+            </w:r>
+          </w:p>
+        </w:tc>
+        <w:tc>
+          <w:tcPr>
+            <w:tcW w:type="dxa" w:w="7560"/>
+            <w:tcBorders>
+              <w:top w:val="single" w:color="CCCCCC" w:sz="1"/>
+              <w:left w:val="single" w:color="CCCCCC" w:sz="1"/>
+              <w:bottom w:val="single" w:color="CCCCCC" w:sz="1"/>
+              <w:right w:val="single" w:color="CCCCCC" w:sz="1"/>
+            </w:tcBorders>
+            <w:tcMar>
+              <w:top w:type="dxa" w:w="80"/>
+              <w:left w:type="dxa" w:w="120"/>
+              <w:bottom w:type="dxa" w:w="80"/>
+              <w:right w:type="dxa" w:w="120"/>
+            </w:tcMar>
+          </w:tcPr>
+          <w:p>
+            <w:r>
+              <w:rPr>
+                <w:rFonts w:ascii="Arial" w:cs="Arial" w:eastAsia="Arial" w:hAnsi="Arial"/>
+                <w:sz w:val="18"/>
+                <w:szCs w:val="18"/>
+              </w:rPr>
+              <w:t xml:space="preserve">SWFL Food Truck Depot</w:t>
+            </w:r>
+          </w:p>
+        </w:tc>
+      </w:tr>
+      <w:tr>
+        <w:tc>
+          <w:tcPr>
+            <w:tcW w:type="dxa" w:w="1800"/>
+            <w:tcBorders>
+              <w:top w:val="single" w:color="CCCCCC" w:sz="1"/>
+              <w:left w:val="single" w:color="CCCCCC" w:sz="1"/>
+              <w:bottom w:val="single" w:color="CCCCCC" w:sz="1"/>
+              <w:right w:val="single" w:color="CCCCCC" w:sz="1"/>
+            </w:tcBorders>
+            <w:shd w:fill="F2F3F4" w:val="clear"/>
+            <w:tcMar>
+              <w:top w:type="dxa" w:w="80"/>
+              <w:left w:type="dxa" w:w="120"/>
+              <w:bottom w:type="dxa" w:w="80"/>
+              <w:right w:type="dxa" w:w="120"/>
+            </w:tcMar>
+          </w:tcPr>
+          <w:p>
+            <w:r>
+              <w:rPr>
+                <w:rFonts w:ascii="Arial" w:cs="Arial" w:eastAsia="Arial" w:hAnsi="Arial"/>
+                <w:b/>
+                <w:bCs/>
+                <w:sz w:val="18"/>
+                <w:szCs w:val="18"/>
+              </w:rPr>
+              <w:t xml:space="preserve">Facebook</w:t>
+            </w:r>
+          </w:p>
+        </w:tc>
+        <w:tc>
+          <w:tcPr>
+            <w:tcW w:type="dxa" w:w="7560"/>
+            <w:tcBorders>
+              <w:top w:val="single" w:color="CCCCCC" w:sz="1"/>
+              <w:left w:val="single" w:color="CCCCCC" w:sz="1"/>
+              <w:bottom w:val="single" w:color="CCCCCC" w:sz="1"/>
+              <w:right w:val="single" w:color="CCCCCC" w:sz="1"/>
+            </w:tcBorders>
+            <w:tcMar>
+              <w:top w:type="dxa" w:w="80"/>
+              <w:left w:type="dxa" w:w="120"/>
+              <w:bottom w:type="dxa" w:w="80"/>
+              <w:right w:type="dxa" w:w="120"/>
+            </w:tcMar>
+          </w:tcPr>
+          <w:p>
+            <w:r>
+              <w:rPr>
+                <w:rFonts w:ascii="Arial" w:cs="Arial" w:eastAsia="Arial" w:hAnsi="Arial"/>
+                <w:sz w:val="18"/>
+                <w:szCs w:val="18"/>
+              </w:rPr>
+              <w:t xml:space="preserve">Reply to Henry F. Amen post in SWFL Food Truck Depot</w:t>
+            </w:r>
+          </w:p>
+        </w:tc>
+      </w:tr>
+      <w:tr>
+        <w:tc>
+          <w:tcPr>
+            <w:tcW w:type="dxa" w:w="1800"/>
+            <w:tcBorders>
+              <w:top w:val="single" w:color="CCCCCC" w:sz="1"/>
+              <w:left w:val="single" w:color="CCCCCC" w:sz="1"/>
+              <w:bottom w:val="single" w:color="CCCCCC" w:sz="1"/>
+              <w:right w:val="single" w:color="CCCCCC" w:sz="1"/>
+            </w:tcBorders>
+            <w:shd w:fill="F2F3F4" w:val="clear"/>
+            <w:tcMar>
+              <w:top w:type="dxa" w:w="80"/>
+              <w:left w:type="dxa" w:w="120"/>
+              <w:bottom w:type="dxa" w:w="80"/>
+              <w:right w:type="dxa" w:w="120"/>
+            </w:tcMar>
+          </w:tcPr>
+          <w:p>
+            <w:r>
+              <w:rPr>
+                <w:rFonts w:ascii="Arial" w:cs="Arial" w:eastAsia="Arial" w:hAnsi="Arial"/>
+                <w:b/>
+                <w:bCs/>
+                <w:sz w:val="18"/>
+                <w:szCs w:val="18"/>
+              </w:rPr>
+              <w:t xml:space="preserve">Location</w:t>
+            </w:r>
+          </w:p>
+        </w:tc>
+        <w:tc>
+          <w:tcPr>
+            <w:tcW w:type="dxa" w:w="7560"/>
+            <w:tcBorders>
+              <w:top w:val="single" w:color="CCCCCC" w:sz="1"/>
+              <w:left w:val="single" w:color="CCCCCC" w:sz="1"/>
+              <w:bottom w:val="single" w:color="CCCCCC" w:sz="1"/>
+              <w:right w:val="single" w:color="CCCCCC" w:sz="1"/>
+            </w:tcBorders>
+            <w:tcMar>
+              <w:top w:type="dxa" w:w="80"/>
+              <w:left w:type="dxa" w:w="120"/>
+              <w:bottom w:type="dxa" w:w="80"/>
+              <w:right w:type="dxa" w:w="120"/>
+            </w:tcMar>
+          </w:tcPr>
+          <w:p>
+            <w:r>
+              <w:rPr>
+                <w:rFonts w:ascii="Arial" w:cs="Arial" w:eastAsia="Arial" w:hAnsi="Arial"/>
+                <w:sz w:val="18"/>
+                <w:szCs w:val="18"/>
+              </w:rPr>
+              <w:t xml:space="preserve">Lago Apartments, Naples, FL</w:t>
+            </w:r>
+          </w:p>
+        </w:tc>
+      </w:tr>
+      <w:tr>
+        <w:tc>
+          <w:tcPr>
+            <w:tcW w:type="dxa" w:w="1800"/>
+            <w:tcBorders>
+              <w:top w:val="single" w:color="CCCCCC" w:sz="1"/>
+              <w:left w:val="single" w:color="CCCCCC" w:sz="1"/>
+              <w:bottom w:val="single" w:color="CCCCCC" w:sz="1"/>
+              <w:right w:val="single" w:color="CCCCCC" w:sz="1"/>
+            </w:tcBorders>
+            <w:shd w:fill="F2F3F4" w:val="clear"/>
+            <w:tcMar>
+              <w:top w:type="dxa" w:w="80"/>
+              <w:left w:type="dxa" w:w="120"/>
+              <w:bottom w:type="dxa" w:w="80"/>
+              <w:right w:type="dxa" w:w="120"/>
+            </w:tcMar>
+          </w:tcPr>
+          <w:p>
+            <w:r>
+              <w:rPr>
+                <w:rFonts w:ascii="Arial" w:cs="Arial" w:eastAsia="Arial" w:hAnsi="Arial"/>
+                <w:b/>
+                <w:bCs/>
+                <w:sz w:val="18"/>
+                <w:szCs w:val="18"/>
+              </w:rPr>
+              <w:t xml:space="preserve">Notes</w:t>
+            </w:r>
+          </w:p>
+        </w:tc>
+        <w:tc>
+          <w:tcPr>
+            <w:tcW w:type="dxa" w:w="7560"/>
+            <w:tcBorders>
+              <w:top w:val="single" w:color="CCCCCC" w:sz="1"/>
+              <w:left w:val="single" w:color="CCCCCC" w:sz="1"/>
+              <w:bottom w:val="single" w:color="CCCCCC" w:sz="1"/>
+              <w:right w:val="single" w:color="CCCCCC" w:sz="1"/>
+            </w:tcBorders>
+            <w:tcMar>
+              <w:top w:type="dxa" w:w="80"/>
+              <w:left w:type="dxa" w:w="120"/>
+              <w:bottom w:type="dxa" w:w="80"/>
+              <w:right w:type="dxa" w:w="120"/>
+            </w:tcMar>
+          </w:tcPr>
+          <w:p>
+            <w:r>
+              <w:rPr>
+                <w:rFonts w:ascii="Arial" w:cs="Arial" w:eastAsia="Arial" w:hAnsi="Arial"/>
+                <w:sz w:val="18"/>
+                <w:szCs w:val="18"/>
+              </w:rPr>
+              <w:t xml:space="preserve">320-unit apartment complex. April 9, 5–8PM slot. 515 reactions — highest-engagement venue post in this window. Da Grub Box already responded 2h in. HIGH VALUE. Move quickly.</w:t>
+            </w:r>
+          </w:p>
+        </w:tc>
+      </w:tr>
+    </w:tbl>
+    <w:p>
+      <w:pPr>
+        <w:pStyle w:val="Heading2"/>
+        <w:pBdr>
+          <w:bottom w:val="single" w:color="6E2F1A" w:sz="4"/>
+        </w:pBdr>
+        <w:spacing w:after="60" w:before="320"/>
+      </w:pPr>
+      <w:r>
+        <w:rPr>
+          <w:rFonts w:ascii="Arial" w:cs="Arial" w:eastAsia="Arial" w:hAnsi="Arial"/>
+          <w:b/>
+          <w:bCs/>
+          <w:color w:val="6E2F1A"/>
+          <w:sz w:val="26"/>
+          <w:szCs w:val="26"/>
+        </w:rPr>
+        <w:t xml:space="preserve">Valerie Cook — Youth Flag Football League</w:t>
+      </w:r>
+    </w:p>
+    <w:tbl>
+      <w:tblPr>
+        <w:tblW w:type="dxa" w:w="9360"/>
+        <w:tblBorders>
+          <w:top w:val="single" w:color="auto" w:sz="4"/>
+          <w:left w:val="single" w:color="auto" w:sz="4"/>
+          <w:bottom w:val="single" w:color="auto" w:sz="4"/>
+          <w:right w:val="single" w:color="auto" w:sz="4"/>
+          <w:insideH w:val="single" w:color="auto" w:sz="4"/>
+          <w:insideV w:val="single" w:color="auto" w:sz="4"/>
+        </w:tblBorders>
+      </w:tblPr>
+      <w:tblGrid>
+        <w:gridCol w:w="1800"/>
+        <w:gridCol w:w="7560"/>
+      </w:tblGrid>
+      <w:tr>
+        <w:tc>
+          <w:tcPr>
+            <w:tcW w:type="dxa" w:w="1800"/>
+            <w:tcBorders>
+              <w:top w:val="single" w:color="CCCCCC" w:sz="1"/>
+              <w:left w:val="single" w:color="CCCCCC" w:sz="1"/>
+              <w:bottom w:val="single" w:color="CCCCCC" w:sz="1"/>
+              <w:right w:val="single" w:color="CCCCCC" w:sz="1"/>
+            </w:tcBorders>
+            <w:shd w:fill="F2F3F4" w:val="clear"/>
+            <w:tcMar>
+              <w:top w:type="dxa" w:w="80"/>
+              <w:left w:type="dxa" w:w="120"/>
+              <w:bottom w:type="dxa" w:w="80"/>
+              <w:right w:type="dxa" w:w="120"/>
+            </w:tcMar>
+          </w:tcPr>
+          <w:p>
+            <w:r>
+              <w:rPr>
+                <w:rFonts w:ascii="Arial" w:cs="Arial" w:eastAsia="Arial" w:hAnsi="Arial"/>
+                <w:b/>
+                <w:bCs/>
+                <w:sz w:val="18"/>
+                <w:szCs w:val="18"/>
+              </w:rPr>
+              <w:t xml:space="preserve">Primary Contact</w:t>
+            </w:r>
+          </w:p>
+        </w:tc>
+        <w:tc>
+          <w:tcPr>
+            <w:tcW w:type="dxa" w:w="7560"/>
+            <w:tcBorders>
+              <w:top w:val="single" w:color="CCCCCC" w:sz="1"/>
+              <w:left w:val="single" w:color="CCCCCC" w:sz="1"/>
+              <w:bottom w:val="single" w:color="CCCCCC" w:sz="1"/>
+              <w:right w:val="single" w:color="CCCCCC" w:sz="1"/>
+            </w:tcBorders>
+            <w:tcMar>
+              <w:top w:type="dxa" w:w="80"/>
+              <w:left w:type="dxa" w:w="120"/>
+              <w:bottom w:type="dxa" w:w="80"/>
+              <w:right w:type="dxa" w:w="120"/>
+            </w:tcMar>
+          </w:tcPr>
+          <w:p>
+            <w:r>
+              <w:rPr>
+                <w:rFonts w:ascii="Arial" w:cs="Arial" w:eastAsia="Arial" w:hAnsi="Arial"/>
+                <w:sz w:val="18"/>
+                <w:szCs w:val="18"/>
+              </w:rPr>
+              <w:t xml:space="preserve">Valerie Cook</w:t>
+            </w:r>
+          </w:p>
+        </w:tc>
+      </w:tr>
+      <w:tr>
+        <w:tc>
+          <w:tcPr>
+            <w:tcW w:type="dxa" w:w="1800"/>
+            <w:tcBorders>
+              <w:top w:val="single" w:color="CCCCCC" w:sz="1"/>
+              <w:left w:val="single" w:color="CCCCCC" w:sz="1"/>
+              <w:bottom w:val="single" w:color="CCCCCC" w:sz="1"/>
+              <w:right w:val="single" w:color="CCCCCC" w:sz="1"/>
+            </w:tcBorders>
+            <w:shd w:fill="F2F3F4" w:val="clear"/>
+            <w:tcMar>
+              <w:top w:type="dxa" w:w="80"/>
+              <w:left w:type="dxa" w:w="120"/>
+              <w:bottom w:type="dxa" w:w="80"/>
+              <w:right w:type="dxa" w:w="120"/>
+            </w:tcMar>
+          </w:tcPr>
+          <w:p>
+            <w:r>
+              <w:rPr>
+                <w:rFonts w:ascii="Arial" w:cs="Arial" w:eastAsia="Arial" w:hAnsi="Arial"/>
+                <w:b/>
+                <w:bCs/>
+                <w:sz w:val="18"/>
+                <w:szCs w:val="18"/>
+              </w:rPr>
+              <w:t xml:space="preserve">Source</w:t>
+            </w:r>
+          </w:p>
+        </w:tc>
+        <w:tc>
+          <w:tcPr>
+            <w:tcW w:type="dxa" w:w="7560"/>
+            <w:tcBorders>
+              <w:top w:val="single" w:color="CCCCCC" w:sz="1"/>
+              <w:left w:val="single" w:color="CCCCCC" w:sz="1"/>
+              <w:bottom w:val="single" w:color="CCCCCC" w:sz="1"/>
+              <w:right w:val="single" w:color="CCCCCC" w:sz="1"/>
+            </w:tcBorders>
+            <w:tcMar>
+              <w:top w:type="dxa" w:w="80"/>
+              <w:left w:type="dxa" w:w="120"/>
+              <w:bottom w:type="dxa" w:w="80"/>
+              <w:right w:type="dxa" w:w="120"/>
+            </w:tcMar>
+          </w:tcPr>
+          <w:p>
+            <w:r>
+              <w:rPr>
+                <w:rFonts w:ascii="Arial" w:cs="Arial" w:eastAsia="Arial" w:hAnsi="Arial"/>
+                <w:sz w:val="18"/>
+                <w:szCs w:val="18"/>
+              </w:rPr>
+              <w:t xml:space="preserve">SWFL Food Truck Depot</w:t>
+            </w:r>
+          </w:p>
+        </w:tc>
+      </w:tr>
+      <w:tr>
+        <w:tc>
+          <w:tcPr>
+            <w:tcW w:type="dxa" w:w="1800"/>
+            <w:tcBorders>
+              <w:top w:val="single" w:color="CCCCCC" w:sz="1"/>
+              <w:left w:val="single" w:color="CCCCCC" w:sz="1"/>
+              <w:bottom w:val="single" w:color="CCCCCC" w:sz="1"/>
+              <w:right w:val="single" w:color="CCCCCC" w:sz="1"/>
+            </w:tcBorders>
+            <w:shd w:fill="F2F3F4" w:val="clear"/>
+            <w:tcMar>
+              <w:top w:type="dxa" w:w="80"/>
+              <w:left w:type="dxa" w:w="120"/>
+              <w:bottom w:type="dxa" w:w="80"/>
+              <w:right w:type="dxa" w:w="120"/>
+            </w:tcMar>
+          </w:tcPr>
+          <w:p>
+            <w:r>
+              <w:rPr>
+                <w:rFonts w:ascii="Arial" w:cs="Arial" w:eastAsia="Arial" w:hAnsi="Arial"/>
+                <w:b/>
+                <w:bCs/>
+                <w:sz w:val="18"/>
+                <w:szCs w:val="18"/>
+              </w:rPr>
+              <w:t xml:space="preserve">Facebook</w:t>
+            </w:r>
+          </w:p>
+        </w:tc>
+        <w:tc>
+          <w:tcPr>
+            <w:tcW w:type="dxa" w:w="7560"/>
+            <w:tcBorders>
+              <w:top w:val="single" w:color="CCCCCC" w:sz="1"/>
+              <w:left w:val="single" w:color="CCCCCC" w:sz="1"/>
+              <w:bottom w:val="single" w:color="CCCCCC" w:sz="1"/>
+              <w:right w:val="single" w:color="CCCCCC" w:sz="1"/>
+            </w:tcBorders>
+            <w:tcMar>
+              <w:top w:type="dxa" w:w="80"/>
+              <w:left w:type="dxa" w:w="120"/>
+              <w:bottom w:type="dxa" w:w="80"/>
+              <w:right w:type="dxa" w:w="120"/>
+            </w:tcMar>
+          </w:tcPr>
+          <w:p>
+            <w:r>
+              <w:rPr>
+                <w:rFonts w:ascii="Arial" w:cs="Arial" w:eastAsia="Arial" w:hAnsi="Arial"/>
+                <w:sz w:val="18"/>
+                <w:szCs w:val="18"/>
+              </w:rPr>
+              <w:t xml:space="preserve">Reply to Valerie Cook post in SWFL Food Truck Depot</w:t>
+            </w:r>
+          </w:p>
+        </w:tc>
+      </w:tr>
+      <w:tr>
+        <w:tc>
+          <w:tcPr>
+            <w:tcW w:type="dxa" w:w="1800"/>
+            <w:tcBorders>
+              <w:top w:val="single" w:color="CCCCCC" w:sz="1"/>
+              <w:left w:val="single" w:color="CCCCCC" w:sz="1"/>
+              <w:bottom w:val="single" w:color="CCCCCC" w:sz="1"/>
+              <w:right w:val="single" w:color="CCCCCC" w:sz="1"/>
+            </w:tcBorders>
+            <w:shd w:fill="F2F3F4" w:val="clear"/>
+            <w:tcMar>
+              <w:top w:type="dxa" w:w="80"/>
+              <w:left w:type="dxa" w:w="120"/>
+              <w:bottom w:type="dxa" w:w="80"/>
+              <w:right w:type="dxa" w:w="120"/>
+            </w:tcMar>
+          </w:tcPr>
+          <w:p>
+            <w:r>
+              <w:rPr>
+                <w:rFonts w:ascii="Arial" w:cs="Arial" w:eastAsia="Arial" w:hAnsi="Arial"/>
+                <w:b/>
+                <w:bCs/>
+                <w:sz w:val="18"/>
+                <w:szCs w:val="18"/>
+              </w:rPr>
+              <w:t xml:space="preserve">Location</w:t>
+            </w:r>
+          </w:p>
+        </w:tc>
+        <w:tc>
+          <w:tcPr>
+            <w:tcW w:type="dxa" w:w="7560"/>
+            <w:tcBorders>
+              <w:top w:val="single" w:color="CCCCCC" w:sz="1"/>
+              <w:left w:val="single" w:color="CCCCCC" w:sz="1"/>
+              <w:bottom w:val="single" w:color="CCCCCC" w:sz="1"/>
+              <w:right w:val="single" w:color="CCCCCC" w:sz="1"/>
+            </w:tcBorders>
+            <w:tcMar>
+              <w:top w:type="dxa" w:w="80"/>
+              <w:left w:type="dxa" w:w="120"/>
+              <w:bottom w:type="dxa" w:w="80"/>
+              <w:right w:type="dxa" w:w="120"/>
+            </w:tcMar>
+          </w:tcPr>
+          <w:p>
+            <w:r>
+              <w:rPr>
+                <w:rFonts w:ascii="Arial" w:cs="Arial" w:eastAsia="Arial" w:hAnsi="Arial"/>
+                <w:sz w:val="18"/>
+                <w:szCs w:val="18"/>
+              </w:rPr>
+              <w:t xml:space="preserve">SWFL (Apple Maps link shared, exact address not captured)</w:t>
+            </w:r>
+          </w:p>
+        </w:tc>
+      </w:tr>
+      <w:tr>
+        <w:tc>
+          <w:tcPr>
+            <w:tcW w:type="dxa" w:w="1800"/>
+            <w:tcBorders>
+              <w:top w:val="single" w:color="CCCCCC" w:sz="1"/>
+              <w:left w:val="single" w:color="CCCCCC" w:sz="1"/>
+              <w:bottom w:val="single" w:color="CCCCCC" w:sz="1"/>
+              <w:right w:val="single" w:color="CCCCCC" w:sz="1"/>
+            </w:tcBorders>
+            <w:shd w:fill="F2F3F4" w:val="clear"/>
+            <w:tcMar>
+              <w:top w:type="dxa" w:w="80"/>
+              <w:left w:type="dxa" w:w="120"/>
+              <w:bottom w:type="dxa" w:w="80"/>
+              <w:right w:type="dxa" w:w="120"/>
+            </w:tcMar>
+          </w:tcPr>
+          <w:p>
+            <w:r>
+              <w:rPr>
+                <w:rFonts w:ascii="Arial" w:cs="Arial" w:eastAsia="Arial" w:hAnsi="Arial"/>
+                <w:b/>
+                <w:bCs/>
+                <w:sz w:val="18"/>
+                <w:szCs w:val="18"/>
+              </w:rPr>
+              <w:t xml:space="preserve">Notes</w:t>
+            </w:r>
+          </w:p>
+        </w:tc>
+        <w:tc>
+          <w:tcPr>
+            <w:tcW w:type="dxa" w:w="7560"/>
+            <w:tcBorders>
+              <w:top w:val="single" w:color="CCCCCC" w:sz="1"/>
+              <w:left w:val="single" w:color="CCCCCC" w:sz="1"/>
+              <w:bottom w:val="single" w:color="CCCCCC" w:sz="1"/>
+              <w:right w:val="single" w:color="CCCCCC" w:sz="1"/>
+            </w:tcBorders>
+            <w:tcMar>
+              <w:top w:type="dxa" w:w="80"/>
+              <w:left w:type="dxa" w:w="120"/>
+              <w:bottom w:type="dxa" w:w="80"/>
+              <w:right w:type="dxa" w:w="120"/>
+            </w:tcMar>
+          </w:tcPr>
+          <w:p>
+            <w:r>
+              <w:rPr>
+                <w:rFonts w:ascii="Arial" w:cs="Arial" w:eastAsia="Arial" w:hAnsi="Arial"/>
+                <w:sz w:val="18"/>
+                <w:szCs w:val="18"/>
+              </w:rPr>
+              <w:t xml:space="preserve">MULTI-EVENT CONTRACT. 5 consecutive Saturdays: May 30, June 6, 13, 20, 27. 8:30AM–3PM each day. 170 registered players, 500+ expected. Sole food vendor (separate iced coffee/lemonade and ice cream). Beach-Bum Johnnie commented 'didn't we already schedule this?' — possible incumbent but unconfirmed. HIGH VALUE.</w:t>
+            </w:r>
+          </w:p>
+        </w:tc>
+      </w:tr>
+    </w:tbl>
+    <w:p>
+      <w:pPr>
+        <w:pStyle w:val="Heading2"/>
+        <w:pBdr>
+          <w:bottom w:val="single" w:color="6E2F1A" w:sz="4"/>
+        </w:pBdr>
+        <w:spacing w:after="60" w:before="320"/>
+      </w:pPr>
+      <w:r>
+        <w:rPr>
+          <w:rFonts w:ascii="Arial" w:cs="Arial" w:eastAsia="Arial" w:hAnsi="Arial"/>
+          <w:b/>
+          <w:bCs/>
+          <w:color w:val="6E2F1A"/>
+          <w:sz w:val="26"/>
+          <w:szCs w:val="26"/>
+        </w:rPr>
+        <w:t xml:space="preserve">Seminole Campground — Cornhole Tournament</w:t>
+      </w:r>
+    </w:p>
+    <w:tbl>
+      <w:tblPr>
+        <w:tblW w:type="dxa" w:w="9360"/>
+        <w:tblBorders>
+          <w:top w:val="single" w:color="auto" w:sz="4"/>
+          <w:left w:val="single" w:color="auto" w:sz="4"/>
+          <w:bottom w:val="single" w:color="auto" w:sz="4"/>
+          <w:right w:val="single" w:color="auto" w:sz="4"/>
+          <w:insideH w:val="single" w:color="auto" w:sz="4"/>
+          <w:insideV w:val="single" w:color="auto" w:sz="4"/>
+        </w:tblBorders>
+      </w:tblPr>
+      <w:tblGrid>
+        <w:gridCol w:w="1800"/>
+        <w:gridCol w:w="7560"/>
+      </w:tblGrid>
+      <w:tr>
+        <w:tc>
+          <w:tcPr>
+            <w:tcW w:type="dxa" w:w="1800"/>
+            <w:tcBorders>
+              <w:top w:val="single" w:color="CCCCCC" w:sz="1"/>
+              <w:left w:val="single" w:color="CCCCCC" w:sz="1"/>
+              <w:bottom w:val="single" w:color="CCCCCC" w:sz="1"/>
+              <w:right w:val="single" w:color="CCCCCC" w:sz="1"/>
+            </w:tcBorders>
+            <w:shd w:fill="F2F3F4" w:val="clear"/>
+            <w:tcMar>
+              <w:top w:type="dxa" w:w="80"/>
+              <w:left w:type="dxa" w:w="120"/>
+              <w:bottom w:type="dxa" w:w="80"/>
+              <w:right w:type="dxa" w:w="120"/>
+            </w:tcMar>
+          </w:tcPr>
+          <w:p>
+            <w:r>
+              <w:rPr>
+                <w:rFonts w:ascii="Arial" w:cs="Arial" w:eastAsia="Arial" w:hAnsi="Arial"/>
+                <w:b/>
+                <w:bCs/>
+                <w:sz w:val="18"/>
+                <w:szCs w:val="18"/>
+              </w:rPr>
+              <w:t xml:space="preserve">Primary Contact</w:t>
+            </w:r>
+          </w:p>
+        </w:tc>
+        <w:tc>
+          <w:tcPr>
+            <w:tcW w:type="dxa" w:w="7560"/>
+            <w:tcBorders>
+              <w:top w:val="single" w:color="CCCCCC" w:sz="1"/>
+              <w:left w:val="single" w:color="CCCCCC" w:sz="1"/>
+              <w:bottom w:val="single" w:color="CCCCCC" w:sz="1"/>
+              <w:right w:val="single" w:color="CCCCCC" w:sz="1"/>
+            </w:tcBorders>
+            <w:tcMar>
+              <w:top w:type="dxa" w:w="80"/>
+              <w:left w:type="dxa" w:w="120"/>
+              <w:bottom w:type="dxa" w:w="80"/>
+              <w:right w:type="dxa" w:w="120"/>
+            </w:tcMar>
+          </w:tcPr>
+          <w:p>
+            <w:r>
+              <w:rPr>
+                <w:rFonts w:ascii="Arial" w:cs="Arial" w:eastAsia="Arial" w:hAnsi="Arial"/>
+                <w:sz w:val="18"/>
+                <w:szCs w:val="18"/>
+              </w:rPr>
+              <w:t xml:space="preserve">Seminole Campground</w:t>
+            </w:r>
+          </w:p>
+        </w:tc>
+      </w:tr>
+      <w:tr>
+        <w:tc>
+          <w:tcPr>
+            <w:tcW w:type="dxa" w:w="1800"/>
+            <w:tcBorders>
+              <w:top w:val="single" w:color="CCCCCC" w:sz="1"/>
+              <w:left w:val="single" w:color="CCCCCC" w:sz="1"/>
+              <w:bottom w:val="single" w:color="CCCCCC" w:sz="1"/>
+              <w:right w:val="single" w:color="CCCCCC" w:sz="1"/>
+            </w:tcBorders>
+            <w:shd w:fill="F2F3F4" w:val="clear"/>
+            <w:tcMar>
+              <w:top w:type="dxa" w:w="80"/>
+              <w:left w:type="dxa" w:w="120"/>
+              <w:bottom w:type="dxa" w:w="80"/>
+              <w:right w:type="dxa" w:w="120"/>
+            </w:tcMar>
+          </w:tcPr>
+          <w:p>
+            <w:r>
+              <w:rPr>
+                <w:rFonts w:ascii="Arial" w:cs="Arial" w:eastAsia="Arial" w:hAnsi="Arial"/>
+                <w:b/>
+                <w:bCs/>
+                <w:sz w:val="18"/>
+                <w:szCs w:val="18"/>
+              </w:rPr>
+              <w:t xml:space="preserve">Source</w:t>
+            </w:r>
+          </w:p>
+        </w:tc>
+        <w:tc>
+          <w:tcPr>
+            <w:tcW w:type="dxa" w:w="7560"/>
+            <w:tcBorders>
+              <w:top w:val="single" w:color="CCCCCC" w:sz="1"/>
+              <w:left w:val="single" w:color="CCCCCC" w:sz="1"/>
+              <w:bottom w:val="single" w:color="CCCCCC" w:sz="1"/>
+              <w:right w:val="single" w:color="CCCCCC" w:sz="1"/>
+            </w:tcBorders>
+            <w:tcMar>
+              <w:top w:type="dxa" w:w="80"/>
+              <w:left w:type="dxa" w:w="120"/>
+              <w:bottom w:type="dxa" w:w="80"/>
+              <w:right w:type="dxa" w:w="120"/>
+            </w:tcMar>
+          </w:tcPr>
+          <w:p>
+            <w:r>
+              <w:rPr>
+                <w:rFonts w:ascii="Arial" w:cs="Arial" w:eastAsia="Arial" w:hAnsi="Arial"/>
+                <w:sz w:val="18"/>
+                <w:szCs w:val="18"/>
+              </w:rPr>
+              <w:t xml:space="preserve">Food Truck Connection of SWFL</w:t>
+            </w:r>
+          </w:p>
+        </w:tc>
+      </w:tr>
+      <w:tr>
+        <w:tc>
+          <w:tcPr>
+            <w:tcW w:type="dxa" w:w="1800"/>
+            <w:tcBorders>
+              <w:top w:val="single" w:color="CCCCCC" w:sz="1"/>
+              <w:left w:val="single" w:color="CCCCCC" w:sz="1"/>
+              <w:bottom w:val="single" w:color="CCCCCC" w:sz="1"/>
+              <w:right w:val="single" w:color="CCCCCC" w:sz="1"/>
+            </w:tcBorders>
+            <w:shd w:fill="F2F3F4" w:val="clear"/>
+            <w:tcMar>
+              <w:top w:type="dxa" w:w="80"/>
+              <w:left w:type="dxa" w:w="120"/>
+              <w:bottom w:type="dxa" w:w="80"/>
+              <w:right w:type="dxa" w:w="120"/>
+            </w:tcMar>
+          </w:tcPr>
+          <w:p>
+            <w:r>
+              <w:rPr>
+                <w:rFonts w:ascii="Arial" w:cs="Arial" w:eastAsia="Arial" w:hAnsi="Arial"/>
+                <w:b/>
+                <w:bCs/>
+                <w:sz w:val="18"/>
+                <w:szCs w:val="18"/>
+              </w:rPr>
+              <w:t xml:space="preserve">Facebook</w:t>
+            </w:r>
+          </w:p>
+        </w:tc>
+        <w:tc>
+          <w:tcPr>
+            <w:tcW w:type="dxa" w:w="7560"/>
+            <w:tcBorders>
+              <w:top w:val="single" w:color="CCCCCC" w:sz="1"/>
+              <w:left w:val="single" w:color="CCCCCC" w:sz="1"/>
+              <w:bottom w:val="single" w:color="CCCCCC" w:sz="1"/>
+              <w:right w:val="single" w:color="CCCCCC" w:sz="1"/>
+            </w:tcBorders>
+            <w:tcMar>
+              <w:top w:type="dxa" w:w="80"/>
+              <w:left w:type="dxa" w:w="120"/>
+              <w:bottom w:type="dxa" w:w="80"/>
+              <w:right w:type="dxa" w:w="120"/>
+            </w:tcMar>
+          </w:tcPr>
+          <w:p>
+            <w:r>
+              <w:rPr>
+                <w:rFonts w:ascii="Arial" w:cs="Arial" w:eastAsia="Arial" w:hAnsi="Arial"/>
+                <w:sz w:val="18"/>
+                <w:szCs w:val="18"/>
+              </w:rPr>
+              <w:t xml:space="preserve">Reply to Seminole Campground post in Food Truck Connection of SWFL</w:t>
+            </w:r>
+          </w:p>
+        </w:tc>
+      </w:tr>
+      <w:tr>
+        <w:tc>
+          <w:tcPr>
+            <w:tcW w:type="dxa" w:w="1800"/>
+            <w:tcBorders>
+              <w:top w:val="single" w:color="CCCCCC" w:sz="1"/>
+              <w:left w:val="single" w:color="CCCCCC" w:sz="1"/>
+              <w:bottom w:val="single" w:color="CCCCCC" w:sz="1"/>
+              <w:right w:val="single" w:color="CCCCCC" w:sz="1"/>
+            </w:tcBorders>
+            <w:shd w:fill="F2F3F4" w:val="clear"/>
+            <w:tcMar>
+              <w:top w:type="dxa" w:w="80"/>
+              <w:left w:type="dxa" w:w="120"/>
+              <w:bottom w:type="dxa" w:w="80"/>
+              <w:right w:type="dxa" w:w="120"/>
+            </w:tcMar>
+          </w:tcPr>
+          <w:p>
+            <w:r>
+              <w:rPr>
+                <w:rFonts w:ascii="Arial" w:cs="Arial" w:eastAsia="Arial" w:hAnsi="Arial"/>
+                <w:b/>
+                <w:bCs/>
+                <w:sz w:val="18"/>
+                <w:szCs w:val="18"/>
+              </w:rPr>
+              <w:t xml:space="preserve">Location</w:t>
+            </w:r>
+          </w:p>
+        </w:tc>
+        <w:tc>
+          <w:tcPr>
+            <w:tcW w:type="dxa" w:w="7560"/>
+            <w:tcBorders>
+              <w:top w:val="single" w:color="CCCCCC" w:sz="1"/>
+              <w:left w:val="single" w:color="CCCCCC" w:sz="1"/>
+              <w:bottom w:val="single" w:color="CCCCCC" w:sz="1"/>
+              <w:right w:val="single" w:color="CCCCCC" w:sz="1"/>
+            </w:tcBorders>
+            <w:tcMar>
+              <w:top w:type="dxa" w:w="80"/>
+              <w:left w:type="dxa" w:w="120"/>
+              <w:bottom w:type="dxa" w:w="80"/>
+              <w:right w:type="dxa" w:w="120"/>
+            </w:tcMar>
+          </w:tcPr>
+          <w:p>
+            <w:r>
+              <w:rPr>
+                <w:rFonts w:ascii="Arial" w:cs="Arial" w:eastAsia="Arial" w:hAnsi="Arial"/>
+                <w:sz w:val="18"/>
+                <w:szCs w:val="18"/>
+              </w:rPr>
+              <w:t xml:space="preserve">Seminole Campground, SWFL</w:t>
+            </w:r>
+          </w:p>
+        </w:tc>
+      </w:tr>
+      <w:tr>
+        <w:tc>
+          <w:tcPr>
+            <w:tcW w:type="dxa" w:w="1800"/>
+            <w:tcBorders>
+              <w:top w:val="single" w:color="CCCCCC" w:sz="1"/>
+              <w:left w:val="single" w:color="CCCCCC" w:sz="1"/>
+              <w:bottom w:val="single" w:color="CCCCCC" w:sz="1"/>
+              <w:right w:val="single" w:color="CCCCCC" w:sz="1"/>
+            </w:tcBorders>
+            <w:shd w:fill="F2F3F4" w:val="clear"/>
+            <w:tcMar>
+              <w:top w:type="dxa" w:w="80"/>
+              <w:left w:type="dxa" w:w="120"/>
+              <w:bottom w:type="dxa" w:w="80"/>
+              <w:right w:type="dxa" w:w="120"/>
+            </w:tcMar>
+          </w:tcPr>
+          <w:p>
+            <w:r>
+              <w:rPr>
+                <w:rFonts w:ascii="Arial" w:cs="Arial" w:eastAsia="Arial" w:hAnsi="Arial"/>
+                <w:b/>
+                <w:bCs/>
+                <w:sz w:val="18"/>
+                <w:szCs w:val="18"/>
+              </w:rPr>
+              <w:t xml:space="preserve">Notes</w:t>
+            </w:r>
+          </w:p>
+        </w:tc>
+        <w:tc>
+          <w:tcPr>
+            <w:tcW w:type="dxa" w:w="7560"/>
+            <w:tcBorders>
+              <w:top w:val="single" w:color="CCCCCC" w:sz="1"/>
+              <w:left w:val="single" w:color="CCCCCC" w:sz="1"/>
+              <w:bottom w:val="single" w:color="CCCCCC" w:sz="1"/>
+              <w:right w:val="single" w:color="CCCCCC" w:sz="1"/>
+            </w:tcBorders>
+            <w:tcMar>
+              <w:top w:type="dxa" w:w="80"/>
+              <w:left w:type="dxa" w:w="120"/>
+              <w:bottom w:type="dxa" w:w="80"/>
+              <w:right w:type="dxa" w:w="120"/>
+            </w:tcMar>
+          </w:tcPr>
+          <w:p>
+            <w:r>
+              <w:rPr>
+                <w:rFonts w:ascii="Arial" w:cs="Arial" w:eastAsia="Arial" w:hAnsi="Arial"/>
+                <w:sz w:val="18"/>
+                <w:szCs w:val="18"/>
+              </w:rPr>
+              <w:t xml:space="preserve">Saturday April 4, 4PM–several hours. Cornhole tournament with visiting campground joining — 60+ expected, possibly 100+. Last-minute request. 34 reactions.</w:t>
+            </w:r>
+          </w:p>
+        </w:tc>
+      </w:tr>
+    </w:tbl>
+    <w:p>
+      <w:pPr>
+        <w:pStyle w:val="Heading2"/>
+        <w:pBdr>
+          <w:bottom w:val="single" w:color="6E2F1A" w:sz="4"/>
+        </w:pBdr>
+        <w:spacing w:after="60" w:before="320"/>
+      </w:pPr>
+      <w:r>
+        <w:rPr>
+          <w:rFonts w:ascii="Arial" w:cs="Arial" w:eastAsia="Arial" w:hAnsi="Arial"/>
+          <w:b/>
+          <w:bCs/>
+          <w:color w:val="6E2F1A"/>
+          <w:sz w:val="26"/>
+          <w:szCs w:val="26"/>
+        </w:rPr>
+        <w:t xml:space="preserve">Jessie Genter — Oak Creek Charter School</w:t>
+      </w:r>
+    </w:p>
+    <w:tbl>
+      <w:tblPr>
+        <w:tblW w:type="dxa" w:w="9360"/>
+        <w:tblBorders>
+          <w:top w:val="single" w:color="auto" w:sz="4"/>
+          <w:left w:val="single" w:color="auto" w:sz="4"/>
+          <w:bottom w:val="single" w:color="auto" w:sz="4"/>
+          <w:right w:val="single" w:color="auto" w:sz="4"/>
+          <w:insideH w:val="single" w:color="auto" w:sz="4"/>
+          <w:insideV w:val="single" w:color="auto" w:sz="4"/>
+        </w:tblBorders>
+      </w:tblPr>
+      <w:tblGrid>
+        <w:gridCol w:w="1800"/>
+        <w:gridCol w:w="7560"/>
+      </w:tblGrid>
+      <w:tr>
+        <w:tc>
+          <w:tcPr>
+            <w:tcW w:type="dxa" w:w="1800"/>
+            <w:tcBorders>
+              <w:top w:val="single" w:color="CCCCCC" w:sz="1"/>
+              <w:left w:val="single" w:color="CCCCCC" w:sz="1"/>
+              <w:bottom w:val="single" w:color="CCCCCC" w:sz="1"/>
+              <w:right w:val="single" w:color="CCCCCC" w:sz="1"/>
+            </w:tcBorders>
+            <w:shd w:fill="F2F3F4" w:val="clear"/>
+            <w:tcMar>
+              <w:top w:type="dxa" w:w="80"/>
+              <w:left w:type="dxa" w:w="120"/>
+              <w:bottom w:type="dxa" w:w="80"/>
+              <w:right w:type="dxa" w:w="120"/>
+            </w:tcMar>
+          </w:tcPr>
+          <w:p>
+            <w:r>
+              <w:rPr>
+                <w:rFonts w:ascii="Arial" w:cs="Arial" w:eastAsia="Arial" w:hAnsi="Arial"/>
+                <w:b/>
+                <w:bCs/>
+                <w:sz w:val="18"/>
+                <w:szCs w:val="18"/>
+              </w:rPr>
+              <w:t xml:space="preserve">Primary Contact</w:t>
+            </w:r>
+          </w:p>
+        </w:tc>
+        <w:tc>
+          <w:tcPr>
+            <w:tcW w:type="dxa" w:w="7560"/>
+            <w:tcBorders>
+              <w:top w:val="single" w:color="CCCCCC" w:sz="1"/>
+              <w:left w:val="single" w:color="CCCCCC" w:sz="1"/>
+              <w:bottom w:val="single" w:color="CCCCCC" w:sz="1"/>
+              <w:right w:val="single" w:color="CCCCCC" w:sz="1"/>
+            </w:tcBorders>
+            <w:tcMar>
+              <w:top w:type="dxa" w:w="80"/>
+              <w:left w:type="dxa" w:w="120"/>
+              <w:bottom w:type="dxa" w:w="80"/>
+              <w:right w:type="dxa" w:w="120"/>
+            </w:tcMar>
+          </w:tcPr>
+          <w:p>
+            <w:r>
+              <w:rPr>
+                <w:rFonts w:ascii="Arial" w:cs="Arial" w:eastAsia="Arial" w:hAnsi="Arial"/>
+                <w:sz w:val="18"/>
+                <w:szCs w:val="18"/>
+              </w:rPr>
+              <w:t xml:space="preserve">Jessie Genter</w:t>
+            </w:r>
+          </w:p>
+        </w:tc>
+      </w:tr>
+      <w:tr>
+        <w:tc>
+          <w:tcPr>
+            <w:tcW w:type="dxa" w:w="1800"/>
+            <w:tcBorders>
+              <w:top w:val="single" w:color="CCCCCC" w:sz="1"/>
+              <w:left w:val="single" w:color="CCCCCC" w:sz="1"/>
+              <w:bottom w:val="single" w:color="CCCCCC" w:sz="1"/>
+              <w:right w:val="single" w:color="CCCCCC" w:sz="1"/>
+            </w:tcBorders>
+            <w:shd w:fill="F2F3F4" w:val="clear"/>
+            <w:tcMar>
+              <w:top w:type="dxa" w:w="80"/>
+              <w:left w:type="dxa" w:w="120"/>
+              <w:bottom w:type="dxa" w:w="80"/>
+              <w:right w:type="dxa" w:w="120"/>
+            </w:tcMar>
+          </w:tcPr>
+          <w:p>
+            <w:r>
+              <w:rPr>
+                <w:rFonts w:ascii="Arial" w:cs="Arial" w:eastAsia="Arial" w:hAnsi="Arial"/>
+                <w:b/>
+                <w:bCs/>
+                <w:sz w:val="18"/>
+                <w:szCs w:val="18"/>
+              </w:rPr>
+              <w:t xml:space="preserve">Source</w:t>
+            </w:r>
+          </w:p>
+        </w:tc>
+        <w:tc>
+          <w:tcPr>
+            <w:tcW w:type="dxa" w:w="7560"/>
+            <w:tcBorders>
+              <w:top w:val="single" w:color="CCCCCC" w:sz="1"/>
+              <w:left w:val="single" w:color="CCCCCC" w:sz="1"/>
+              <w:bottom w:val="single" w:color="CCCCCC" w:sz="1"/>
+              <w:right w:val="single" w:color="CCCCCC" w:sz="1"/>
+            </w:tcBorders>
+            <w:tcMar>
+              <w:top w:type="dxa" w:w="80"/>
+              <w:left w:type="dxa" w:w="120"/>
+              <w:bottom w:type="dxa" w:w="80"/>
+              <w:right w:type="dxa" w:w="120"/>
+            </w:tcMar>
+          </w:tcPr>
+          <w:p>
+            <w:r>
+              <w:rPr>
+                <w:rFonts w:ascii="Arial" w:cs="Arial" w:eastAsia="Arial" w:hAnsi="Arial"/>
+                <w:sz w:val="18"/>
+                <w:szCs w:val="18"/>
+              </w:rPr>
+              <w:t xml:space="preserve">SWFL Food Truck Depot (comment on Firebread post)</w:t>
+            </w:r>
+          </w:p>
+        </w:tc>
+      </w:tr>
+      <w:tr>
+        <w:tc>
+          <w:tcPr>
+            <w:tcW w:type="dxa" w:w="1800"/>
+            <w:tcBorders>
+              <w:top w:val="single" w:color="CCCCCC" w:sz="1"/>
+              <w:left w:val="single" w:color="CCCCCC" w:sz="1"/>
+              <w:bottom w:val="single" w:color="CCCCCC" w:sz="1"/>
+              <w:right w:val="single" w:color="CCCCCC" w:sz="1"/>
+            </w:tcBorders>
+            <w:shd w:fill="F2F3F4" w:val="clear"/>
+            <w:tcMar>
+              <w:top w:type="dxa" w:w="80"/>
+              <w:left w:type="dxa" w:w="120"/>
+              <w:bottom w:type="dxa" w:w="80"/>
+              <w:right w:type="dxa" w:w="120"/>
+            </w:tcMar>
+          </w:tcPr>
+          <w:p>
+            <w:r>
+              <w:rPr>
+                <w:rFonts w:ascii="Arial" w:cs="Arial" w:eastAsia="Arial" w:hAnsi="Arial"/>
+                <w:b/>
+                <w:bCs/>
+                <w:sz w:val="18"/>
+                <w:szCs w:val="18"/>
+              </w:rPr>
+              <w:t xml:space="preserve">Facebook</w:t>
+            </w:r>
+          </w:p>
+        </w:tc>
+        <w:tc>
+          <w:tcPr>
+            <w:tcW w:type="dxa" w:w="7560"/>
+            <w:tcBorders>
+              <w:top w:val="single" w:color="CCCCCC" w:sz="1"/>
+              <w:left w:val="single" w:color="CCCCCC" w:sz="1"/>
+              <w:bottom w:val="single" w:color="CCCCCC" w:sz="1"/>
+              <w:right w:val="single" w:color="CCCCCC" w:sz="1"/>
+            </w:tcBorders>
+            <w:tcMar>
+              <w:top w:type="dxa" w:w="80"/>
+              <w:left w:type="dxa" w:w="120"/>
+              <w:bottom w:type="dxa" w:w="80"/>
+              <w:right w:type="dxa" w:w="120"/>
+            </w:tcMar>
+          </w:tcPr>
+          <w:p>
+            <w:r>
+              <w:rPr>
+                <w:rFonts w:ascii="Arial" w:cs="Arial" w:eastAsia="Arial" w:hAnsi="Arial"/>
+                <w:sz w:val="18"/>
+                <w:szCs w:val="18"/>
+              </w:rPr>
+              <w:t xml:space="preserve">DM Jessie Genter</w:t>
+            </w:r>
+          </w:p>
+        </w:tc>
+      </w:tr>
+      <w:tr>
+        <w:tc>
+          <w:tcPr>
+            <w:tcW w:type="dxa" w:w="1800"/>
+            <w:tcBorders>
+              <w:top w:val="single" w:color="CCCCCC" w:sz="1"/>
+              <w:left w:val="single" w:color="CCCCCC" w:sz="1"/>
+              <w:bottom w:val="single" w:color="CCCCCC" w:sz="1"/>
+              <w:right w:val="single" w:color="CCCCCC" w:sz="1"/>
+            </w:tcBorders>
+            <w:shd w:fill="F2F3F4" w:val="clear"/>
+            <w:tcMar>
+              <w:top w:type="dxa" w:w="80"/>
+              <w:left w:type="dxa" w:w="120"/>
+              <w:bottom w:type="dxa" w:w="80"/>
+              <w:right w:type="dxa" w:w="120"/>
+            </w:tcMar>
+          </w:tcPr>
+          <w:p>
+            <w:r>
+              <w:rPr>
+                <w:rFonts w:ascii="Arial" w:cs="Arial" w:eastAsia="Arial" w:hAnsi="Arial"/>
+                <w:b/>
+                <w:bCs/>
+                <w:sz w:val="18"/>
+                <w:szCs w:val="18"/>
+              </w:rPr>
+              <w:t xml:space="preserve">Location</w:t>
+            </w:r>
+          </w:p>
+        </w:tc>
+        <w:tc>
+          <w:tcPr>
+            <w:tcW w:type="dxa" w:w="7560"/>
+            <w:tcBorders>
+              <w:top w:val="single" w:color="CCCCCC" w:sz="1"/>
+              <w:left w:val="single" w:color="CCCCCC" w:sz="1"/>
+              <w:bottom w:val="single" w:color="CCCCCC" w:sz="1"/>
+              <w:right w:val="single" w:color="CCCCCC" w:sz="1"/>
+            </w:tcBorders>
+            <w:tcMar>
+              <w:top w:type="dxa" w:w="80"/>
+              <w:left w:type="dxa" w:w="120"/>
+              <w:bottom w:type="dxa" w:w="80"/>
+              <w:right w:type="dxa" w:w="120"/>
+            </w:tcMar>
+          </w:tcPr>
+          <w:p>
+            <w:r>
+              <w:rPr>
+                <w:rFonts w:ascii="Arial" w:cs="Arial" w:eastAsia="Arial" w:hAnsi="Arial"/>
+                <w:sz w:val="18"/>
+                <w:szCs w:val="18"/>
+              </w:rPr>
+              <w:t xml:space="preserve">Oak Creek Charter School, SWFL</w:t>
+            </w:r>
+          </w:p>
+        </w:tc>
+      </w:tr>
+      <w:tr>
+        <w:tc>
+          <w:tcPr>
+            <w:tcW w:type="dxa" w:w="1800"/>
+            <w:tcBorders>
+              <w:top w:val="single" w:color="CCCCCC" w:sz="1"/>
+              <w:left w:val="single" w:color="CCCCCC" w:sz="1"/>
+              <w:bottom w:val="single" w:color="CCCCCC" w:sz="1"/>
+              <w:right w:val="single" w:color="CCCCCC" w:sz="1"/>
+            </w:tcBorders>
+            <w:shd w:fill="F2F3F4" w:val="clear"/>
+            <w:tcMar>
+              <w:top w:type="dxa" w:w="80"/>
+              <w:left w:type="dxa" w:w="120"/>
+              <w:bottom w:type="dxa" w:w="80"/>
+              <w:right w:type="dxa" w:w="120"/>
+            </w:tcMar>
+          </w:tcPr>
+          <w:p>
+            <w:r>
+              <w:rPr>
+                <w:rFonts w:ascii="Arial" w:cs="Arial" w:eastAsia="Arial" w:hAnsi="Arial"/>
+                <w:b/>
+                <w:bCs/>
+                <w:sz w:val="18"/>
+                <w:szCs w:val="18"/>
+              </w:rPr>
+              <w:t xml:space="preserve">Notes</w:t>
+            </w:r>
+          </w:p>
+        </w:tc>
+        <w:tc>
+          <w:tcPr>
+            <w:tcW w:type="dxa" w:w="7560"/>
+            <w:tcBorders>
+              <w:top w:val="single" w:color="CCCCCC" w:sz="1"/>
+              <w:left w:val="single" w:color="CCCCCC" w:sz="1"/>
+              <w:bottom w:val="single" w:color="CCCCCC" w:sz="1"/>
+              <w:right w:val="single" w:color="CCCCCC" w:sz="1"/>
+            </w:tcBorders>
+            <w:tcMar>
+              <w:top w:type="dxa" w:w="80"/>
+              <w:left w:type="dxa" w:w="120"/>
+              <w:bottom w:type="dxa" w:w="80"/>
+              <w:right w:type="dxa" w:w="120"/>
+            </w:tcMar>
+          </w:tcPr>
+          <w:p>
+            <w:r>
+              <w:rPr>
+                <w:rFonts w:ascii="Arial" w:cs="Arial" w:eastAsia="Arial" w:hAnsi="Arial"/>
+                <w:sz w:val="18"/>
+                <w:szCs w:val="18"/>
+              </w:rPr>
+              <w:t xml:space="preserve">April 24, staff lunch event. Found via comment on Firebread's schedule post. School-category event.</w:t>
+            </w:r>
+          </w:p>
+        </w:tc>
+      </w:tr>
+    </w:tbl>
     <w:sectPr>
-      <w:footerReference w:type="default" r:id="rId6"/>
-      <w:pgSz w:w="12240" w:h="15840" w:orient="portrait"/>
-      <w:pgMar w:top="1080" w:right="1080" w:bottom="1080" w:left="1080" w:header="708" w:footer="708" w:gutter="0"/>
+      <w:pgSz w:w="11906" w:h="16838" w:orient="portrait"/>
+      <w:pgMar w:top="1440" w:right="1440" w:bottom="1440" w:left="1440" w:header="708" w:footer="708" w:gutter="0"/>
       <w:pgNumType/>
       <w:docGrid w:linePitch="360"/>
     </w:sectPr>
@@ -5458,35 +7048,41 @@
 <w:comments xmlns:cx="http://schemas.microsoft.com/office/drawing/2014/chartex" xmlns:cx1="http://schemas.microsoft.com/office/drawing/2015/9/8/chartex" xmlns:cx2="http://schemas.microsoft.com/office/drawing/2015/10/21/chartex" xmlns:cx3="http://schemas.microsoft.com/office/drawing/2016/5/9/chartex" xmlns:cx4="http://schemas.microsoft.com/office/drawing/2016/5/10/chartex" xmlns:cx5="http://schemas.microsoft.com/office/drawing/2016/5/11/chartex" xmlns:cx6="http://schemas.microsoft.com/office/drawing/2016/5/12/chartex" xmlns:cx7="http://schemas.microsoft.com/office/drawing/2016/5/13/chartex" xmlns:cx8="http://schemas.microsoft.com/office/drawing/2016/5/14/chartex" xmlns:mc="http://schemas.openxmlformats.org/markup-compatibility/2006" xmlns:aink="http://schemas.microsoft.com/office/drawing/2016/ink" xmlns:am3d="http://schemas.microsoft.com/office/drawing/2017/model3d" xmlns:o="urn:schemas-microsoft-com:office:office" xmlns:r="http://schemas.openxmlformats.org/officeDocument/2006/relationships" xmlns:m="http://schemas.openxmlformats.org/officeDocument/2006/math" xmlns:v="urn:schemas-microsoft-com:vml" xmlns:wp14="http://schemas.microsoft.com/office/word/2010/wordprocessingDrawing" xmlns:wp="http://schemas.openxmlformats.org/drawingml/2006/wordprocessingDrawing" xmlns:w10="urn:schemas-microsoft-com:office:word" xmlns:w="http://schemas.openxmlformats.org/wordprocessingml/2006/main" xmlns:w14="http://schemas.microsoft.com/office/word/2010/wordml" xmlns:w15="http://schemas.microsoft.com/office/word/2012/wordml" xmlns:w16cex="http://schemas.microsoft.com/office/word/2018/wordml/cex" xmlns:w16cid="http://schemas.microsoft.com/office/word/2016/wordml/cid" xmlns:w16="http://schemas.microsoft.com/office/word/2018/wordml" xmlns:w16sdtdh="http://schemas.microsoft.com/office/word/2020/wordml/sdtdatahash" xmlns:w16se="http://schemas.microsoft.com/office/word/2015/wordml/symex" xmlns:wpg="http://schemas.microsoft.com/office/word/2010/wordprocessingGroup" xmlns:wpi="http://schemas.microsoft.com/office/word/2010/wordprocessingInk" xmlns:wne="http://schemas.microsoft.com/office/word/2006/wordml" xmlns:wps="http://schemas.microsoft.com/office/word/2010/wordprocessingShape"/>
 </file>
 
-<file path=word/footer1.xml><?xml version="1.0" encoding="utf-8"?>
-<w:ftr xmlns:wpc="http://schemas.microsoft.com/office/word/2010/wordprocessingCanvas" xmlns:mc="http://schemas.openxmlformats.org/markup-compatibility/2006" xmlns:o="urn:schemas-microsoft-com:office:office" xmlns:r="http://schemas.openxmlformats.org/officeDocument/2006/relationships" xmlns:m="http://schemas.openxmlformats.org/officeDocument/2006/math" xmlns:v="urn:schemas-microsoft-com:vml" xmlns:wp14="http://schemas.microsoft.com/office/word/2010/wordprocessingDrawing" xmlns:wp="http://schemas.openxmlformats.org/drawingml/2006/wordprocessingDrawing" xmlns:w10="urn:schemas-microsoft-com:office:word" xmlns:w="http://schemas.openxmlformats.org/wordprocessingml/2006/main" xmlns:w14="http://schemas.microsoft.com/office/word/2010/wordml" xmlns:w15="http://schemas.microsoft.com/office/word/2012/wordml" xmlns:wpg="http://schemas.microsoft.com/office/word/2010/wordprocessingGroup" xmlns:wpi="http://schemas.microsoft.com/office/word/2010/wordprocessingInk" xmlns:wne="http://schemas.microsoft.com/office/word/2006/wordml" xmlns:wps="http://schemas.microsoft.com/office/word/2010/wordprocessingShape">
-  <w:p>
-    <w:pPr>
-      <w:jc w:val="center"/>
-    </w:pPr>
-    <w:r>
-      <w:rPr>
-        <w:rFonts w:ascii="Arial" w:cs="Arial" w:eastAsia="Arial" w:hAnsi="Arial"/>
-        <w:color w:val="7F8C8D"/>
-        <w:sz w:val="16"/>
-        <w:szCs w:val="16"/>
-      </w:rPr>
-      <w:t xml:space="preserve">Truck Requesters  |  ServiceWindow Market Research  |  Page </w:t>
-    </w:r>
-    <w:r>
-      <w:rPr>
-        <w:rFonts w:ascii="Arial" w:cs="Arial" w:eastAsia="Arial" w:hAnsi="Arial"/>
-        <w:color w:val="7F8C8D"/>
-        <w:sz w:val="16"/>
-        <w:szCs w:val="16"/>
-      </w:rPr>
-      <w:fldChar w:fldCharType="begin"/>
-      <w:instrText xml:space="preserve">PAGE</w:instrText>
-      <w:fldChar w:fldCharType="separate"/>
-      <w:fldChar w:fldCharType="end"/>
-    </w:r>
-  </w:p>
-</w:ftr>
+<file path=word/endnotes.xml><?xml version="1.0" encoding="utf-8"?>
+<w:endnotes xmlns:wpc="http://schemas.microsoft.com/office/word/2010/wordprocessingCanvas" xmlns:mc="http://schemas.openxmlformats.org/markup-compatibility/2006" xmlns:o="urn:schemas-microsoft-com:office:office" xmlns:r="http://schemas.openxmlformats.org/officeDocument/2006/relationships" xmlns:m="http://schemas.openxmlformats.org/officeDocument/2006/math" xmlns:v="urn:schemas-microsoft-com:vml" xmlns:wp14="http://schemas.microsoft.com/office/word/2010/wordprocessingDrawing" xmlns:wp="http://schemas.openxmlformats.org/drawingml/2006/wordprocessingDrawing" xmlns:w10="urn:schemas-microsoft-com:office:word" xmlns:w="http://schemas.openxmlformats.org/wordprocessingml/2006/main" xmlns:w14="http://schemas.microsoft.com/office/word/2010/wordml" xmlns:w15="http://schemas.microsoft.com/office/word/2012/wordml" xmlns:wpg="http://schemas.microsoft.com/office/word/2010/wordprocessingGroup" xmlns:wpi="http://schemas.microsoft.com/office/word/2010/wordprocessingInk" xmlns:wne="http://schemas.microsoft.com/office/word/2006/wordml" xmlns:wps="http://schemas.microsoft.com/office/word/2010/wordprocessingShape" mc:Ignorable="w14 w15 wp14">
+  <w:endnote w:type="separator" w:id="-1">
+    <w:p>
+      <w:pPr>
+        <w:spacing w:after="0" w:line="240" w:lineRule="auto"/>
+      </w:pPr>
+      <w:r>
+        <w:rPr>
+          <w:rStyle w:val="EndnoteReference"/>
+        </w:rPr>
+        <w:endnoteRef/>
+      </w:r>
+      <w:r>
+        <w:separator/>
+      </w:r>
+    </w:p>
+  </w:endnote>
+  <w:endnote w:type="continuationSeparator" w:id="0">
+    <w:p>
+      <w:pPr>
+        <w:spacing w:after="0" w:line="240" w:lineRule="auto"/>
+      </w:pPr>
+      <w:r>
+        <w:rPr>
+          <w:rStyle w:val="EndnoteReference"/>
+        </w:rPr>
+        <w:endnoteRef/>
+      </w:r>
+      <w:r>
+        <w:continuationSeparator/>
+      </w:r>
+    </w:p>
+  </w:endnote>
+</w:endnotes>
 </file>
 
 <file path=word/footnotes.xml><?xml version="1.0" encoding="utf-8"?>
@@ -5767,13 +7363,50 @@
       <w:szCs w:val="20"/>
     </w:rPr>
   </w:style>
+  <w:style w:type="character" w:styleId="EndnoteReference">
+    <w:name w:val="endnote reference"/>
+    <w:basedOn w:val="DefaultParagraphFont"/>
+    <w:uiPriority w:val="99"/>
+    <w:semiHidden/>
+    <w:unhideWhenUsed/>
+    <w:rPr>
+      <w:vertAlign w:val="superscript"/>
+    </w:rPr>
+  </w:style>
+  <w:style w:type="paragraph" w:styleId="EndnoteText">
+    <w:name w:val="endnote text"/>
+    <w:basedOn w:val="Normal"/>
+    <w:link w:val="EndnoteTextChar"/>
+    <w:uiPriority w:val="99"/>
+    <w:semiHidden/>
+    <w:unhideWhenUsed/>
+    <w:pPr>
+      <w:spacing w:after="0" w:line="240" w:lineRule="auto"/>
+    </w:pPr>
+    <w:rPr>
+      <w:sz w:val="20"/>
+      <w:szCs w:val="20"/>
+    </w:rPr>
+  </w:style>
+  <w:style w:type="character" w:styleId="EndnoteTextChar">
+    <w:name w:val="Endnote Text Char"/>
+    <w:basedOn w:val="DefaultParagraphFont"/>
+    <w:link w:val="EndnoteText"/>
+    <w:uiPriority w:val="99"/>
+    <w:semiHidden/>
+    <w:unhideWhenUsed/>
+    <w:rPr>
+      <w:sz w:val="20"/>
+      <w:szCs w:val="20"/>
+    </w:rPr>
+  </w:style>
   <w:style w:type="paragraph" w:styleId="Heading1">
     <w:name w:val="Heading 1"/>
     <w:basedOn w:val="Normal"/>
     <w:next w:val="Normal"/>
     <w:qFormat/>
     <w:pPr>
-      <w:spacing w:before="240" w:after="0"/>
+      <w:spacing w:after="0" w:before="240"/>
       <w:outlineLvl w:val="0"/>
     </w:pPr>
     <w:rPr>
@@ -5791,7 +7424,7 @@
     <w:next w:val="Normal"/>
     <w:qFormat/>
     <w:pPr>
-      <w:spacing w:before="280" w:after="60"/>
+      <w:spacing w:after="60" w:before="280"/>
       <w:outlineLvl w:val="1"/>
     </w:pPr>
     <w:rPr>

</xml_diff>